<commit_message>
manual release of Forty Seconds
Co-Authored-By: Claude Haiku 4.5 <noreply@anthropic.com>
</commit_message>
<xml_diff>
--- a/stories/detective_noir/Forty Seconds.docx
+++ b/stories/detective_noir/Forty Seconds.docx
@@ -11,17 +11,36 @@
       </w:r>
     </w:p>
     <w:p>
-      <w:r>
-        <w:t>Written &amp; edited by Thomas Butler</w:t>
-      </w:r>
-    </w:p>
-    <w:p>
-      <w:r>
-        <w:t>Pictures by Rebecca Stewart</w:t>
-      </w:r>
-    </w:p>
-    <w:p>
-      <w:pPr>
+      <w:pPr>
+        <w:jc w:val="center"/>
+      </w:pPr>
+      <w:r>
+        <w:rPr>
+          <w:rStyle w:val="Emphasis"/>
+        </w:rPr>
+        <w:t>Written by</w:t>
+      </w:r>
+      <w:r>
+        <w:t xml:space="preserve"> Thomas Butler</w:t>
+      </w:r>
+    </w:p>
+    <w:p>
+      <w:pPr>
+        <w:jc w:val="center"/>
+      </w:pPr>
+      <w:r>
+        <w:rPr>
+          <w:rStyle w:val="Emphasis"/>
+        </w:rPr>
+        <w:t>Pictures by</w:t>
+      </w:r>
+      <w:r>
+        <w:t xml:space="preserve"> Rebecca Stewart</w:t>
+      </w:r>
+    </w:p>
+    <w:p>
+      <w:pPr>
+        <w:jc w:val="center"/>
         <w:sectPr>
           <w:headerReference w:type="even" r:id="rId7"/>
           <w:headerReference w:type="default" r:id="rId8"/>
@@ -32,7 +51,13 @@
         </w:sectPr>
       </w:pPr>
       <w:r>
-        <w:t>Additional Editing by Ruth-Ann Butler</w:t>
+        <w:rPr>
+          <w:rStyle w:val="Emphasis"/>
+        </w:rPr>
+        <w:t>Additional Editing by</w:t>
+      </w:r>
+      <w:r>
+        <w:t xml:space="preserve"> Ruth-Ann Butler</w:t>
       </w:r>
     </w:p>
     <w:p>
@@ -63,12 +88,15 @@
         <w:pStyle w:val="NoSpacing"/>
       </w:pPr>
       <w:r>
+        <w:rPr>
+          <w:noProof/>
+        </w:rPr>
         <w:lastRenderedPageBreak/>
         <w:drawing>
-          <wp:inline distT="0" distB="0" distL="0" distR="0" wp14:anchorId="1B000F90" wp14:editId="12634162">
-            <wp:extent cx="3474720" cy="5045644"/>
-            <wp:effectExtent l="0" t="0" r="0" b="3175"/>
-            <wp:docPr id="40" name="Picture 40" descr="Stripes clinging to the bedpost"/>
+          <wp:inline distT="0" distB="0" distL="0" distR="0" wp14:anchorId="152ADB83" wp14:editId="64E237E6">
+            <wp:extent cx="3474720" cy="6266227"/>
+            <wp:effectExtent l="0" t="0" r="0" b="1270"/>
+            <wp:docPr id="8" name="Picture 8" descr="Stripes clinging to the bedpost"/>
             <wp:cNvGraphicFramePr>
               <a:graphicFrameLocks xmlns:a="http://schemas.openxmlformats.org/drawingml/2006/main" noChangeAspect="1"/>
             </wp:cNvGraphicFramePr>
@@ -76,12 +104,12 @@
               <a:graphicData uri="http://schemas.openxmlformats.org/drawingml/2006/picture">
                 <pic:pic xmlns:pic="http://schemas.openxmlformats.org/drawingml/2006/picture">
                   <pic:nvPicPr>
-                    <pic:cNvPr id="0" name="Picture 143" descr="Stripes clinging to the bedpost"/>
+                    <pic:cNvPr id="0" name="Picture 5" descr="Stripes clinging to the bedpost"/>
                     <pic:cNvPicPr>
                       <a:picLocks noChangeAspect="1" noChangeArrowheads="1"/>
                     </pic:cNvPicPr>
                   </pic:nvPicPr>
-                  <pic:blipFill>
+                  <pic:blipFill rotWithShape="1">
                     <a:blip r:embed="rId9" cstate="print">
                       <a:extLst>
                         <a:ext uri="{28A0092B-C50C-407E-A947-70E740481C1C}">
@@ -89,15 +117,13 @@
                         </a:ext>
                       </a:extLst>
                     </a:blip>
-                    <a:srcRect/>
-                    <a:stretch>
-                      <a:fillRect/>
-                    </a:stretch>
+                    <a:srcRect l="18988" t="15025" r="19220" b="8235"/>
+                    <a:stretch/>
                   </pic:blipFill>
                   <pic:spPr bwMode="auto">
                     <a:xfrm>
                       <a:off x="0" y="0"/>
-                      <a:ext cx="3474720" cy="5045644"/>
+                      <a:ext cx="3474720" cy="6266227"/>
                     </a:xfrm>
                     <a:prstGeom prst="rect">
                       <a:avLst/>
@@ -106,6 +132,11 @@
                     <a:ln>
                       <a:noFill/>
                     </a:ln>
+                    <a:extLst>
+                      <a:ext uri="{53640926-AAD7-44D8-BBD7-CCE9431645EC}">
+                        <a14:shadowObscured xmlns:a14="http://schemas.microsoft.com/office/drawing/2010/main"/>
+                      </a:ext>
+                    </a:extLst>
                   </pic:spPr>
                 </pic:pic>
               </a:graphicData>
@@ -115,66 +146,50 @@
       </w:r>
     </w:p>
     <w:p>
-      <w:pPr>
-        <w:ind w:firstLine="0"/>
-        <w:contextualSpacing w:val="0"/>
+      <w:r>
+        <w:lastRenderedPageBreak/>
+        <w:t>He called the police with trembling fingers.</w:t>
+      </w:r>
+    </w:p>
+    <w:p>
+      <w:r>
+        <w:t>They arrived within the hour — two uniforms, bored on a Monday, expecting a noise complaint or a missing wallet. What they found was Francois, still attached to the furniture, eyes wild, unable to speak in full sentences.</w:t>
+      </w:r>
+    </w:p>
+    <w:p>
+      <w:r>
+        <w:t>"In there," he managed. "The next room. She's — I can't — just go look."</w:t>
+      </w:r>
+    </w:p>
+    <w:p>
+      <w:r>
+        <w:t>They looked.</w:t>
+      </w:r>
+    </w:p>
+    <w:p>
+      <w:r>
+        <w:t>She was on the floor. Face down. Arms out. Not moving. Not breathing. A stuffed ostrich in a teal collar who went by the name Vivian Plume, and who would never again make anyone's acquaintance.</w:t>
+      </w:r>
+    </w:p>
+    <w:p>
+      <w:r>
+        <w:t>The officers exchanged a glance.</w:t>
+      </w:r>
+    </w:p>
+    <w:p>
+      <w:pPr>
+        <w:pStyle w:val="NoSpacing"/>
+      </w:pPr>
+      <w:r>
         <w:rPr>
-          <w:rFonts w:asciiTheme="minorHAnsi" w:hAnsiTheme="minorHAnsi"/>
-          <w:sz w:val="20"/>
+          <w:noProof/>
         </w:rPr>
-      </w:pPr>
-      <w:r>
-        <w:br w:type="page"/>
-      </w:r>
-    </w:p>
-    <w:p>
-      <w:pPr>
-        <w:pStyle w:val="NoSpacing"/>
-      </w:pPr>
-    </w:p>
-    <w:p>
-      <w:r>
-        <w:t>He called the police with trembling fingers.</w:t>
-      </w:r>
-    </w:p>
-    <w:p>
-      <w:r>
-        <w:t>They arrived within the hour — two uniforms, bored on a Monday, expecting a noise complaint or a missing wallet. What they found was Francois, still attached to the furniture, eyes wild, unable to speak in full sentences.</w:t>
-      </w:r>
-    </w:p>
-    <w:p>
-      <w:r>
-        <w:rPr>
-          <w:rStyle w:val="Emphasis"/>
-        </w:rPr>
-        <w:t>“In there,”</w:t>
-      </w:r>
-      <w:r>
-        <w:t> he managed. </w:t>
-      </w:r>
-      <w:r>
-        <w:rPr>
-          <w:rStyle w:val="Emphasis"/>
-        </w:rPr>
-        <w:t>“The next room. She's — I can't — just go look.”</w:t>
-      </w:r>
-    </w:p>
-    <w:p>
-      <w:r>
-        <w:t>They looked.</w:t>
-      </w:r>
-    </w:p>
-    <w:p>
-      <w:pPr>
-        <w:pStyle w:val="NoSpacing"/>
-      </w:pPr>
-      <w:r>
         <w:lastRenderedPageBreak/>
         <w:drawing>
-          <wp:inline distT="0" distB="0" distL="0" distR="0" wp14:anchorId="43411940" wp14:editId="6610F903">
-            <wp:extent cx="3474720" cy="5402580"/>
+          <wp:inline distT="0" distB="0" distL="0" distR="0" wp14:anchorId="2833EC62" wp14:editId="25C19B25">
+            <wp:extent cx="3474720" cy="5383656"/>
             <wp:effectExtent l="0" t="0" r="0" b="7620"/>
-            <wp:docPr id="39" name="Picture 39" descr="Vivian Plume face down on the carpet"/>
+            <wp:docPr id="7" name="Picture 7" descr="Vivian Plume face down on the carpet"/>
             <wp:cNvGraphicFramePr>
               <a:graphicFrameLocks xmlns:a="http://schemas.openxmlformats.org/drawingml/2006/main" noChangeAspect="1"/>
             </wp:cNvGraphicFramePr>
@@ -182,12 +197,12 @@
               <a:graphicData uri="http://schemas.openxmlformats.org/drawingml/2006/picture">
                 <pic:pic xmlns:pic="http://schemas.openxmlformats.org/drawingml/2006/picture">
                   <pic:nvPicPr>
-                    <pic:cNvPr id="0" name="Picture 144" descr="Vivian Plume face down on the carpet"/>
+                    <pic:cNvPr id="0" name="Picture 6" descr="Vivian Plume face down on the carpet"/>
                     <pic:cNvPicPr>
                       <a:picLocks noChangeAspect="1" noChangeArrowheads="1"/>
                     </pic:cNvPicPr>
                   </pic:nvPicPr>
-                  <pic:blipFill>
+                  <pic:blipFill rotWithShape="1">
                     <a:blip r:embed="rId10" cstate="print">
                       <a:extLst>
                         <a:ext uri="{28A0092B-C50C-407E-A947-70E740481C1C}">
@@ -195,15 +210,13 @@
                         </a:ext>
                       </a:extLst>
                     </a:blip>
-                    <a:srcRect/>
-                    <a:stretch>
-                      <a:fillRect/>
-                    </a:stretch>
+                    <a:srcRect l="13991" t="11359" r="5055" b="7952"/>
+                    <a:stretch/>
                   </pic:blipFill>
                   <pic:spPr bwMode="auto">
                     <a:xfrm>
                       <a:off x="0" y="0"/>
-                      <a:ext cx="3474720" cy="5402580"/>
+                      <a:ext cx="3474720" cy="5383656"/>
                     </a:xfrm>
                     <a:prstGeom prst="rect">
                       <a:avLst/>
@@ -212,6 +225,11 @@
                     <a:ln>
                       <a:noFill/>
                     </a:ln>
+                    <a:extLst>
+                      <a:ext uri="{53640926-AAD7-44D8-BBD7-CCE9431645EC}">
+                        <a14:shadowObscured xmlns:a14="http://schemas.microsoft.com/office/drawing/2010/main"/>
+                      </a:ext>
+                    </a:extLst>
                   </pic:spPr>
                 </pic:pic>
               </a:graphicData>
@@ -234,32 +252,9 @@
       </w:r>
     </w:p>
     <w:p>
-      <w:pPr>
-        <w:pStyle w:val="NoSpacing"/>
-      </w:pPr>
-    </w:p>
-    <w:p>
-      <w:r>
-        <w:t>She was on the floor. Face down. Arms out. Not moving. Not breathing. A stuffed ostrich in a teal collar who went by the name Vivian Plume, and who would never again make anyone's acquaintance.</w:t>
-      </w:r>
-    </w:p>
-    <w:p>
-      <w:r>
-        <w:t>The officers exchanged a glance.</w:t>
-      </w:r>
-    </w:p>
-    <w:p>
-      <w:r>
-        <w:t>The lead officer snapped his notebook shut. </w:t>
-      </w:r>
-      <w:r>
-        <w:rPr>
-          <w:rStyle w:val="Emphasis"/>
-        </w:rPr>
-        <w:t>“We'll file a report,”</w:t>
-      </w:r>
-      <w:r>
-        <w:t> he said, in the tone of a man who was already thinking about lunch.</w:t>
+      <w:r>
+        <w:lastRenderedPageBreak/>
+        <w:t>The lead officer snapped his notebook shut. "We'll file a report," he said, in the tone of a man who was already thinking about lunch.</w:t>
       </w:r>
     </w:p>
     <w:p>
@@ -339,134 +334,69 @@
     </w:p>
     <w:p>
       <w:r>
-        <w:t>But Francois was persistent. He leaned in, voice low and urgent, chipping away — planting small seeds of doubt, little splinters of argument that lodged themselves just under the skin — </w:t>
-      </w:r>
-      <w:r>
+        <w:t>But Francois was persistent. He leaned in, voice low and urgent, chipping away — planting small seeds of doubt, little splinters of argument that lodged themselves just under the skin — "What if the police botch it? What if justice is never served? Where is the hope, and where is the faith? What if the truth just disappears, like she did?"</w:t>
+      </w:r>
+    </w:p>
+    <w:p>
+      <w:r>
+        <w:t>He stopped. "Don't try too hard to think," he said. "Don't —" He paused. Seemed to lose it briefly. "If there's an order in all of this disorder — I just need to know what it is."</w:t>
+      </w:r>
+    </w:p>
+    <w:p>
+      <w:r>
+        <w:t>Then, just for a moment — half a second, maybe less — something crossed his face. Not grief, not urgency. Something that looked, just briefly, almost like terror. Then it was gone, and he was back, hands clasped, eyes searching Tom's face like nothing had happened.</w:t>
+      </w:r>
+    </w:p>
+    <w:p>
+      <w:r>
+        <w:lastRenderedPageBreak/>
+        <w:t>Tom filed it away — the thing he couldn't name. He'd spent twenty years developing an instinct, and the instinct was making noise. Francois said all the right things in all the right order, and his devastation seemed genuine, and none of that stopped the quiet alarm going off somewhere below Tom's conscious mind. A man in genuine shock didn't argue this well. A man in genuine shock didn't land his points this cleanly. Tom had the distinct and unverifiable sense of being steered.</w:t>
+      </w:r>
+    </w:p>
+    <w:p>
+      <w:r>
+        <w:t>The other thing — smaller, harder to name — was the rhythm of some of it. The phrasing. Every so often Francois would say something and it would scan differently — like he was receiving the words rather than choosing them. Too even. A little too complete. Like a line from a song, almost — like it had a life that predated the conversation it arrived in.</w:t>
+      </w:r>
+    </w:p>
+    <w:p>
+      <w:r>
+        <w:t>He should have walked away. He knew he should have walked away.</w:t>
+      </w:r>
+    </w:p>
+    <w:p>
+      <w:r>
+        <w:t>"He just needs to know who did this," Francois said. "Francois deserves that much."</w:t>
+      </w:r>
+    </w:p>
+    <w:p>
+      <w:r>
+        <w:t xml:space="preserve">Tom sat with his fist pressed hard against his chin, eyes fixed on the middle distance. Two alarm systems going off at once. The instinct. The rumors. He turned the shape of the thing over, looking for the angle that held, looking for the </w:t>
+      </w:r>
+      <w:r>
+        <w:lastRenderedPageBreak/>
+        <w:t>solid ground of reason in a conversation that kept moving the floor on him.</w:t>
+      </w:r>
+    </w:p>
+    <w:p>
+      <w:pPr>
         <w:rPr>
-          <w:rStyle w:val="Emphasis"/>
+          <w:noProof/>
         </w:rPr>
-        <w:t>What if the police botch it? What if justice is never served? Where is the hope, and where is the faith?</w:t>
-      </w:r>
-      <w:r>
-        <w:t> </w:t>
-      </w:r>
+      </w:pPr>
+    </w:p>
+    <w:p>
+      <w:pPr>
+        <w:pStyle w:val="NoSpacing"/>
+      </w:pPr>
       <w:r>
         <w:rPr>
-          <w:rStyle w:val="Emphasis"/>
+          <w:noProof/>
         </w:rPr>
-        <w:t>What if the truth just disappears, like she did?</w:t>
-      </w:r>
-    </w:p>
-    <w:p>
-      <w:r>
-        <w:t>He stopped. </w:t>
-      </w:r>
-      <w:proofErr w:type="gramStart"/>
-      <w:r>
-        <w:rPr>
-          <w:rStyle w:val="Emphasis"/>
-        </w:rPr>
-        <w:t>”Don't</w:t>
-      </w:r>
-      <w:proofErr w:type="gramEnd"/>
-      <w:r>
-        <w:rPr>
-          <w:rStyle w:val="Emphasis"/>
-        </w:rPr>
-        <w:t xml:space="preserve"> try too hard to think,”</w:t>
-      </w:r>
-      <w:r>
-        <w:t> he said. </w:t>
-      </w:r>
-      <w:proofErr w:type="gramStart"/>
-      <w:r>
-        <w:rPr>
-          <w:rStyle w:val="Emphasis"/>
-        </w:rPr>
-        <w:t>”Don't</w:t>
-      </w:r>
-      <w:proofErr w:type="gramEnd"/>
-      <w:r>
-        <w:rPr>
-          <w:rStyle w:val="Emphasis"/>
-        </w:rPr>
-        <w:t xml:space="preserve"> —“</w:t>
-      </w:r>
-      <w:r>
-        <w:t> He paused. Seemed to lose it briefly. </w:t>
-      </w:r>
-      <w:proofErr w:type="gramStart"/>
-      <w:r>
-        <w:rPr>
-          <w:rStyle w:val="Emphasis"/>
-        </w:rPr>
-        <w:t>”If</w:t>
-      </w:r>
-      <w:proofErr w:type="gramEnd"/>
-      <w:r>
-        <w:rPr>
-          <w:rStyle w:val="Emphasis"/>
-        </w:rPr>
-        <w:t xml:space="preserve"> there's an order in all of this disorder — I just need to know what it is.”</w:t>
-      </w:r>
-    </w:p>
-    <w:p>
-      <w:r>
-        <w:t>Then, just for a moment — half a second, maybe less — something crossed his face. Not grief, not urgency. Something that looked, just briefly, almost like terror. Then it was gone, and he was back, hands clasped, eyes searching Tom's face like nothing had happened.</w:t>
-      </w:r>
-    </w:p>
-    <w:p>
-      <w:r>
-        <w:t xml:space="preserve">Tom filed it away — the thing he couldn't name. He'd spent twenty years developing an </w:t>
-      </w:r>
-      <w:r>
-        <w:lastRenderedPageBreak/>
-        <w:t>instinct, and the instinct was making noise. Francois said all the right things in all the right order, and his devastation seemed genuine, and none of that stopped the quiet alarm going off somewhere below Tom's conscious mind. A man in genuine shock didn't argue this well. A man in genuine shock didn't land his points this cleanly. Tom had the distinct and unverifiable sense of being steered.</w:t>
-      </w:r>
-    </w:p>
-    <w:p>
-      <w:r>
-        <w:t>The other thing — smaller, harder to name — was the rhythm of some of it. The phrasing. Every so often Francois would say something and it would scan differently — like he was receiving the words rather than choosing them. Too even. A little too complete. Like a line from a song, almost — like it had a life that predated the conversation it arrived in.</w:t>
-      </w:r>
-    </w:p>
-    <w:p>
-      <w:r>
-        <w:t>He should have walked away. He knew he should have walked away.</w:t>
-      </w:r>
-    </w:p>
-    <w:p>
-      <w:r>
-        <w:rPr>
-          <w:rStyle w:val="Emphasis"/>
-        </w:rPr>
-        <w:t>“He just needs to know who did this,”</w:t>
-      </w:r>
-      <w:r>
-        <w:t> Francois said. </w:t>
-      </w:r>
-      <w:r>
-        <w:rPr>
-          <w:rStyle w:val="Emphasis"/>
-        </w:rPr>
-        <w:t>“Francois deserves that much.”</w:t>
-      </w:r>
-    </w:p>
-    <w:p>
-      <w:r>
-        <w:t>Tom sat with his fist pressed hard against his chin, eyes fixed on the middle distance. Two alarm systems going off at once. The instinct. The rumors. He turned the shape of the thing over, looking for the angle that held, looking for the solid ground of reason in a conversation that kept moving the floor on him.</w:t>
-      </w:r>
-    </w:p>
-    <w:p>
-      <w:pPr>
-        <w:pStyle w:val="NoSpacing"/>
-      </w:pPr>
-      <w:r>
-        <w:lastRenderedPageBreak/>
         <w:drawing>
-          <wp:inline distT="0" distB="0" distL="0" distR="0" wp14:anchorId="7BC08F21" wp14:editId="3039EBD9">
-            <wp:extent cx="3474720" cy="5222355"/>
-            <wp:effectExtent l="0" t="0" r="0" b="0"/>
-            <wp:docPr id="38" name="Picture 38" descr="Tom fist to chin"/>
+          <wp:inline distT="0" distB="0" distL="0" distR="0" wp14:anchorId="6B00437D" wp14:editId="75FFCC7C">
+            <wp:extent cx="3474720" cy="5058326"/>
+            <wp:effectExtent l="0" t="0" r="0" b="9525"/>
+            <wp:docPr id="6" name="Picture 6" descr="Tom fist to chin"/>
             <wp:cNvGraphicFramePr>
               <a:graphicFrameLocks xmlns:a="http://schemas.openxmlformats.org/drawingml/2006/main" noChangeAspect="1"/>
             </wp:cNvGraphicFramePr>
@@ -474,12 +404,12 @@
               <a:graphicData uri="http://schemas.openxmlformats.org/drawingml/2006/picture">
                 <pic:pic xmlns:pic="http://schemas.openxmlformats.org/drawingml/2006/picture">
                   <pic:nvPicPr>
-                    <pic:cNvPr id="0" name="Picture 145" descr="Tom fist to chin"/>
+                    <pic:cNvPr id="0" name="Picture 7" descr="Tom fist to chin"/>
                     <pic:cNvPicPr>
                       <a:picLocks noChangeAspect="1" noChangeArrowheads="1"/>
                     </pic:cNvPicPr>
                   </pic:nvPicPr>
-                  <pic:blipFill>
+                  <pic:blipFill rotWithShape="1">
                     <a:blip r:embed="rId11" cstate="print">
                       <a:extLst>
                         <a:ext uri="{28A0092B-C50C-407E-A947-70E740481C1C}">
@@ -487,15 +417,13 @@
                         </a:ext>
                       </a:extLst>
                     </a:blip>
-                    <a:srcRect/>
-                    <a:stretch>
-                      <a:fillRect/>
-                    </a:stretch>
+                    <a:srcRect l="3498" t="23497" r="17530"/>
+                    <a:stretch/>
                   </pic:blipFill>
                   <pic:spPr bwMode="auto">
                     <a:xfrm>
                       <a:off x="0" y="0"/>
-                      <a:ext cx="3474720" cy="5222355"/>
+                      <a:ext cx="3474720" cy="5058326"/>
                     </a:xfrm>
                     <a:prstGeom prst="rect">
                       <a:avLst/>
@@ -504,6 +432,11 @@
                     <a:ln>
                       <a:noFill/>
                     </a:ln>
+                    <a:extLst>
+                      <a:ext uri="{53640926-AAD7-44D8-BBD7-CCE9431645EC}">
+                        <a14:shadowObscured xmlns:a14="http://schemas.microsoft.com/office/drawing/2010/main"/>
+                      </a:ext>
+                    </a:extLst>
                   </pic:spPr>
                 </pic:pic>
               </a:graphicData>
@@ -519,38 +452,30 @@
     </w:p>
     <w:p>
       <w:r>
-        <w:rPr>
-          <w:rStyle w:val="Emphasis"/>
-        </w:rPr>
-        <w:t>“Fine,”</w:t>
-      </w:r>
-      <w:r>
-        <w:t> he said. </w:t>
-      </w:r>
-      <w:r>
-        <w:rPr>
-          <w:rStyle w:val="Emphasis"/>
-        </w:rPr>
-        <w:t>“But I do this my way.”</w:t>
-      </w:r>
-    </w:p>
-    <w:p>
-      <w:r>
+        <w:t>"Fine," he said. "But I do this my way."</w:t>
+      </w:r>
+    </w:p>
+    <w:p>
+      <w:pPr>
+        <w:pStyle w:val="Heading1"/>
+      </w:pPr>
+      <w:r>
+        <w:lastRenderedPageBreak/>
         <w:t>3</w:t>
       </w:r>
     </w:p>
     <w:p>
       <w:r>
-        <w:t xml:space="preserve">Tom worked the case for three days straight. He followed every thread until the threads led </w:t>
+        <w:t>Tom worked the case for three days straight. He followed every thread until the threads led somewhere ugly. And they always led somewhere ugly.</w:t>
+      </w:r>
+    </w:p>
+    <w:p>
+      <w:r>
+        <w:t xml:space="preserve">Everyone he talked to said Vivian had been worried about Francois for weeks. Nobody had done anything about it, including her. He went through the rooms on the second day. The bed with its missing occupant. A boombox. Scissors. A coffee cup. Three days of unopened mail. Expecting nothing. What he found was a folded piece of paper in her desk drawer — not a diary, not a letter. A list. Eight or nine lines in her handwriting, each one something Francois had said. No dates. No context. Just the words, because the words had been strange enough to write down. Most of them Tom couldn't place. </w:t>
       </w:r>
       <w:r>
         <w:lastRenderedPageBreak/>
-        <w:t>somewhere ugly. And they always led somewhere ugly.</w:t>
-      </w:r>
-    </w:p>
-    <w:p>
-      <w:r>
-        <w:t>Everyone he talked to said Vivian had been worried about Francois for weeks. Nobody had done anything about it, including her. He went through the rooms on the second day. The bed with its missing occupant. A boombox. Scissors. A coffee cup. Three days of unopened mail. Expecting nothing. What he found was a folded piece of paper in her desk drawer — not a diary, not a letter. A list. Eight or nine lines in her handwriting, each one something Francois had said. No dates. No context. Just the words, because the words had been strange enough to write down. Most of them Tom couldn't place. But near the bottom, underlined twice, with a question mark beside it: </w:t>
+        <w:t>But near the bottom, underlined twice, with a question mark beside it: </w:t>
       </w:r>
       <w:r>
         <w:rPr>
@@ -576,7 +501,6 @@
     </w:p>
     <w:p>
       <w:r>
-        <w:lastRenderedPageBreak/>
         <w:t>It sat on the bed like an altar. A U2 CD loaded in the tray. Tom stood over it, not moving. He knew this smell. He knew what the boombox was. He knew what the boombox had done. He knew what pressing play would mean.</w:t>
       </w:r>
     </w:p>
@@ -617,13 +541,26 @@
       </w:r>
     </w:p>
     <w:p>
-      <w:r>
+      <w:pPr>
+        <w:rPr>
+          <w:noProof/>
+        </w:rPr>
+      </w:pPr>
+    </w:p>
+    <w:p>
+      <w:pPr>
+        <w:pStyle w:val="NoSpacing"/>
+      </w:pPr>
+      <w:r>
+        <w:rPr>
+          <w:noProof/>
+        </w:rPr>
         <w:lastRenderedPageBreak/>
         <w:drawing>
-          <wp:inline distT="0" distB="0" distL="0" distR="0" wp14:anchorId="253FE6B1" wp14:editId="74945A8C">
-            <wp:extent cx="5241290" cy="8229600"/>
+          <wp:inline distT="0" distB="0" distL="0" distR="0" wp14:anchorId="042A1517" wp14:editId="6523663E">
+            <wp:extent cx="3474720" cy="4841672"/>
             <wp:effectExtent l="0" t="0" r="0" b="0"/>
-            <wp:docPr id="37" name="Picture 37" descr="Stripes on the boombox"/>
+            <wp:docPr id="5" name="Picture 5" descr="Stripes on the boombox"/>
             <wp:cNvGraphicFramePr>
               <a:graphicFrameLocks xmlns:a="http://schemas.openxmlformats.org/drawingml/2006/main" noChangeAspect="1"/>
             </wp:cNvGraphicFramePr>
@@ -631,12 +568,12 @@
               <a:graphicData uri="http://schemas.openxmlformats.org/drawingml/2006/picture">
                 <pic:pic xmlns:pic="http://schemas.openxmlformats.org/drawingml/2006/picture">
                   <pic:nvPicPr>
-                    <pic:cNvPr id="0" name="Picture 146" descr="Stripes on the boombox"/>
+                    <pic:cNvPr id="0" name="Picture 8" descr="Stripes on the boombox"/>
                     <pic:cNvPicPr>
                       <a:picLocks noChangeAspect="1" noChangeArrowheads="1"/>
                     </pic:cNvPicPr>
                   </pic:nvPicPr>
-                  <pic:blipFill>
+                  <pic:blipFill rotWithShape="1">
                     <a:blip r:embed="rId12" cstate="print">
                       <a:extLst>
                         <a:ext uri="{28A0092B-C50C-407E-A947-70E740481C1C}">
@@ -644,15 +581,13 @@
                         </a:ext>
                       </a:extLst>
                     </a:blip>
-                    <a:srcRect/>
-                    <a:stretch>
-                      <a:fillRect/>
-                    </a:stretch>
+                    <a:srcRect l="1166" t="12303"/>
+                    <a:stretch/>
                   </pic:blipFill>
                   <pic:spPr bwMode="auto">
                     <a:xfrm>
                       <a:off x="0" y="0"/>
-                      <a:ext cx="5241290" cy="8229600"/>
+                      <a:ext cx="3474720" cy="4841672"/>
                     </a:xfrm>
                     <a:prstGeom prst="rect">
                       <a:avLst/>
@@ -661,6 +596,11 @@
                     <a:ln>
                       <a:noFill/>
                     </a:ln>
+                    <a:extLst>
+                      <a:ext uri="{53640926-AAD7-44D8-BBD7-CCE9431645EC}">
+                        <a14:shadowObscured xmlns:a14="http://schemas.microsoft.com/office/drawing/2010/main"/>
+                      </a:ext>
+                    </a:extLst>
                   </pic:spPr>
                 </pic:pic>
               </a:graphicData>
@@ -671,8 +611,11 @@
     </w:p>
     <w:p>
       <w:r>
+        <w:t xml:space="preserve">The picture became clear. Francois had found the album. Had listened — once, probably, just to see what all the fuss was about. That's how it always started. Just once. And then the music had gotten into him, into the soft tissue behind his eyes, and it had begun its quiet, patient work. Rewriting things. Darkening corners. Turning a </w:t>
+      </w:r>
+      <w:r>
         <w:lastRenderedPageBreak/>
-        <w:t>The picture became clear. Francois had found the album. Had listened — once, probably, just to see what all the fuss was about. That's how it always started. Just once. And then the music had gotten into him, into the soft tissue behind his eyes, and it had begun its quiet, patient work. Rewriting things. Darkening corners. Turning a reasonable man into something that could look at Vivian — innocent Vivian — and decide she knew too much.</w:t>
+        <w:t>reasonable man into something that could look at Vivian — innocent Vivian — and decide she knew too much.</w:t>
       </w:r>
     </w:p>
     <w:p>
@@ -690,13 +633,7 @@
         <w:t>He went back to Francois.</w:t>
       </w:r>
     </w:p>
-    <w:p>
-      <w:r>
-        <w:pict w14:anchorId="1F81D7F7">
-          <v:rect id="_x0000_i1252" style="width:0;height:1.5pt" o:hralign="center" o:hrstd="t" o:hr="t" fillcolor="#a0a0a0" stroked="f"/>
-        </w:pict>
-      </w:r>
-    </w:p>
+    <w:p/>
     <w:p>
       <w:r>
         <w:t>The interrogation was quiet at first. Tom laid out what he knew, piece by piece, watching Francois's face for the cracks. They came slowly, then all at once. Francois looked out the window at the dark nothing beyond the glass.</w:t>
@@ -709,55 +646,33 @@
     </w:p>
     <w:p>
       <w:r>
+        <w:t>"Yes," he said quietly. "I did it."</w:t>
+      </w:r>
+    </w:p>
+    <w:p>
+      <w:r>
+        <w:t>He turned to face Tom.</w:t>
+      </w:r>
+    </w:p>
+    <w:p>
+      <w:r>
+        <w:t>"I strangled her. No emotional good night."</w:t>
+      </w:r>
+    </w:p>
+    <w:p>
+      <w:pPr>
+        <w:pStyle w:val="NoSpacing"/>
+      </w:pPr>
+      <w:r>
         <w:rPr>
-          <w:rStyle w:val="Emphasis"/>
+          <w:noProof/>
         </w:rPr>
-        <w:t>“Yes,”</w:t>
-      </w:r>
-      <w:r>
-        <w:t> he said quietly. </w:t>
-      </w:r>
-      <w:r>
-        <w:rPr>
-          <w:rStyle w:val="Emphasis"/>
-        </w:rPr>
-        <w:t>“I did it.”</w:t>
-      </w:r>
-    </w:p>
-    <w:p>
-      <w:r>
-        <w:t>He turned to face Tom.</w:t>
-      </w:r>
-    </w:p>
-    <w:p>
-      <w:pPr>
-        <w:rPr>
-          <w:rStyle w:val="Emphasis"/>
-        </w:rPr>
-      </w:pPr>
-      <w:proofErr w:type="gramStart"/>
-      <w:r>
-        <w:rPr>
-          <w:rStyle w:val="Emphasis"/>
-        </w:rPr>
-        <w:t>”I</w:t>
-      </w:r>
-      <w:proofErr w:type="gramEnd"/>
-      <w:r>
-        <w:rPr>
-          <w:rStyle w:val="Emphasis"/>
-        </w:rPr>
-        <w:t xml:space="preserve"> strangled her. No emotional good night.”</w:t>
-      </w:r>
-    </w:p>
-    <w:p>
-      <w:r>
         <w:lastRenderedPageBreak/>
         <w:drawing>
-          <wp:inline distT="0" distB="0" distL="0" distR="0" wp14:anchorId="5346D308" wp14:editId="2D26C181">
-            <wp:extent cx="5943600" cy="3930650"/>
+          <wp:inline distT="0" distB="0" distL="0" distR="0" wp14:anchorId="55D1B989" wp14:editId="494C5D1A">
+            <wp:extent cx="3474720" cy="2787999"/>
             <wp:effectExtent l="0" t="0" r="0" b="0"/>
-            <wp:docPr id="36" name="Picture 36" descr="Stripes strangling Vivian Plume"/>
+            <wp:docPr id="4" name="Picture 4" descr="Stripes strangling Vivian Plume"/>
             <wp:cNvGraphicFramePr>
               <a:graphicFrameLocks xmlns:a="http://schemas.openxmlformats.org/drawingml/2006/main" noChangeAspect="1"/>
             </wp:cNvGraphicFramePr>
@@ -765,12 +680,12 @@
               <a:graphicData uri="http://schemas.openxmlformats.org/drawingml/2006/picture">
                 <pic:pic xmlns:pic="http://schemas.openxmlformats.org/drawingml/2006/picture">
                   <pic:nvPicPr>
-                    <pic:cNvPr id="0" name="Picture 148" descr="Stripes strangling Vivian Plume"/>
+                    <pic:cNvPr id="0" name="Picture 10" descr="Stripes strangling Vivian Plume"/>
                     <pic:cNvPicPr>
                       <a:picLocks noChangeAspect="1" noChangeArrowheads="1"/>
                     </pic:cNvPicPr>
                   </pic:nvPicPr>
-                  <pic:blipFill>
+                  <pic:blipFill rotWithShape="1">
                     <a:blip r:embed="rId13" cstate="print">
                       <a:extLst>
                         <a:ext uri="{28A0092B-C50C-407E-A947-70E740481C1C}">
@@ -778,15 +693,13 @@
                         </a:ext>
                       </a:extLst>
                     </a:blip>
-                    <a:srcRect/>
-                    <a:stretch>
-                      <a:fillRect/>
-                    </a:stretch>
+                    <a:srcRect l="16161" t="22413" r="19887"/>
+                    <a:stretch/>
                   </pic:blipFill>
                   <pic:spPr bwMode="auto">
                     <a:xfrm>
                       <a:off x="0" y="0"/>
-                      <a:ext cx="5943600" cy="3930650"/>
+                      <a:ext cx="3474720" cy="2787999"/>
                     </a:xfrm>
                     <a:prstGeom prst="rect">
                       <a:avLst/>
@@ -795,6 +708,11 @@
                     <a:ln>
                       <a:noFill/>
                     </a:ln>
+                    <a:extLst>
+                      <a:ext uri="{53640926-AAD7-44D8-BBD7-CCE9431645EC}">
+                        <a14:shadowObscured xmlns:a14="http://schemas.microsoft.com/office/drawing/2010/main"/>
+                      </a:ext>
+                    </a:extLst>
                   </pic:spPr>
                 </pic:pic>
               </a:graphicData>
@@ -809,52 +727,13 @@
       </w:r>
     </w:p>
     <w:p>
-      <w:pPr>
-        <w:rPr>
-          <w:rStyle w:val="Emphasis"/>
-        </w:rPr>
-      </w:pPr>
-      <w:r>
-        <w:rPr>
-          <w:rStyle w:val="Emphasis"/>
-        </w:rPr>
-        <w:t>“Why?”</w:t>
-      </w:r>
-    </w:p>
-    <w:p>
-      <w:r>
-        <w:t>Francois looked at the window. </w:t>
-      </w:r>
-      <w:proofErr w:type="gramStart"/>
-      <w:r>
-        <w:rPr>
-          <w:rStyle w:val="Emphasis"/>
-        </w:rPr>
-        <w:t>”She</w:t>
-      </w:r>
-      <w:proofErr w:type="gramEnd"/>
-      <w:r>
-        <w:rPr>
-          <w:rStyle w:val="Emphasis"/>
-        </w:rPr>
-        <w:t xml:space="preserve"> felt the ground was giving way,”</w:t>
-      </w:r>
-      <w:r>
-        <w:t> he said simply. </w:t>
-      </w:r>
-      <w:proofErr w:type="gramStart"/>
-      <w:r>
-        <w:rPr>
-          <w:rStyle w:val="Emphasis"/>
-        </w:rPr>
-        <w:t>”Better</w:t>
-      </w:r>
-      <w:proofErr w:type="gramEnd"/>
-      <w:r>
-        <w:rPr>
-          <w:rStyle w:val="Emphasis"/>
-        </w:rPr>
-        <w:t xml:space="preserve"> off that way.”</w:t>
+      <w:r>
+        <w:t>"Why?"</w:t>
+      </w:r>
+    </w:p>
+    <w:p>
+      <w:r>
+        <w:t>Francois looked at the window. "She felt the ground was giving way," he said simply. "Better off that way."</w:t>
       </w:r>
     </w:p>
     <w:p>
@@ -864,33 +743,21 @@
     </w:p>
     <w:p>
       <w:r>
-        <w:t xml:space="preserve">He already knew, of course. He'd pressed play. He'd felt the corruption move through him </w:t>
+        <w:t>He already knew, of course. He'd pressed play. He'd felt the corruption move through him like cold water — forty seconds of it, quiet and patient and rewriting things. He understood exactly what had entered Francois's mind.</w:t>
+      </w:r>
+    </w:p>
+    <w:p>
+      <w:r>
+        <w:t xml:space="preserve">And then, because he was the kind of detective who couldn't leave a loose thread, he </w:t>
       </w:r>
       <w:r>
         <w:lastRenderedPageBreak/>
-        <w:t>like cold water — forty seconds of it, quiet and patient and rewriting things. He understood exactly what had entered Francois's mind.</w:t>
-      </w:r>
-    </w:p>
-    <w:p>
-      <w:r>
-        <w:t>And then, because he was the kind of detective who couldn't leave a loose thread, he asked the question that had been sitting at the back of his mind since the very first day.</w:t>
-      </w:r>
-    </w:p>
-    <w:p>
-      <w:r>
-        <w:rPr>
-          <w:rStyle w:val="Emphasis"/>
-        </w:rPr>
-        <w:t>“Then why,”</w:t>
-      </w:r>
-      <w:r>
-        <w:t> he said slowly, </w:t>
-      </w:r>
-      <w:r>
-        <w:rPr>
-          <w:rStyle w:val="Emphasis"/>
-        </w:rPr>
-        <w:t>“did you hire me?”</w:t>
+        <w:t>asked the question that had been sitting at the back of his mind since the very first day.</w:t>
+      </w:r>
+    </w:p>
+    <w:p>
+      <w:r>
+        <w:t>"Then why," he said slowly, "did you hire me?"</w:t>
       </w:r>
     </w:p>
     <w:p>
@@ -913,11 +780,7 @@
     </w:p>
     <w:p>
       <w:r>
-        <w:t xml:space="preserve">And then he thought about forty seconds of music moving through him. He thought about what that same thing, given more time, </w:t>
-      </w:r>
-      <w:r>
-        <w:lastRenderedPageBreak/>
-        <w:t>given </w:t>
+        <w:t>And then he thought about forty seconds of music moving through him. He thought about what that same thing, given more time, given </w:t>
       </w:r>
       <w:r>
         <w:rPr>
@@ -926,7 +789,11 @@
         <w:t>much</w:t>
       </w:r>
       <w:r>
-        <w:t> more time — given enough time to finish what it started — might do to the architecture of a mind. Whether it would hollow a man out all at once, or whether it would take him room by room, leaving some parts intact while it worked on the others.</w:t>
+        <w:t xml:space="preserve"> more time — given enough time to finish what it started — might do to the architecture of a mind. Whether it would hollow a man out all at once, or whether it would take him </w:t>
+      </w:r>
+      <w:r>
+        <w:lastRenderedPageBreak/>
+        <w:t>room by room, leaving some parts intact while it worked on the others.</w:t>
       </w:r>
     </w:p>
     <w:p>
@@ -981,13 +848,26 @@
       </w:r>
     </w:p>
     <w:p>
-      <w:r>
-        <w:lastRenderedPageBreak/>
+      <w:pPr>
+        <w:pStyle w:val="NoSpacing"/>
+        <w:rPr>
+          <w:noProof/>
+        </w:rPr>
+      </w:pPr>
+    </w:p>
+    <w:p>
+      <w:pPr>
+        <w:pStyle w:val="NoSpacing"/>
+      </w:pPr>
+      <w:r>
+        <w:rPr>
+          <w:noProof/>
+        </w:rPr>
         <w:drawing>
-          <wp:inline distT="0" distB="0" distL="0" distR="0" wp14:anchorId="5F1AAB80" wp14:editId="4440A7E7">
-            <wp:extent cx="5943600" cy="3949065"/>
-            <wp:effectExtent l="0" t="0" r="0" b="0"/>
-            <wp:docPr id="35" name="Picture 35" descr="Stripes wielding scissors"/>
+          <wp:inline distT="0" distB="0" distL="0" distR="0" wp14:anchorId="69C7975B" wp14:editId="01AFD0A4">
+            <wp:extent cx="3474541" cy="3064168"/>
+            <wp:effectExtent l="0" t="0" r="0" b="3175"/>
+            <wp:docPr id="3" name="Picture 3" descr="Stripes wielding scissors"/>
             <wp:cNvGraphicFramePr>
               <a:graphicFrameLocks xmlns:a="http://schemas.openxmlformats.org/drawingml/2006/main" noChangeAspect="1"/>
             </wp:cNvGraphicFramePr>
@@ -995,12 +875,12 @@
               <a:graphicData uri="http://schemas.openxmlformats.org/drawingml/2006/picture">
                 <pic:pic xmlns:pic="http://schemas.openxmlformats.org/drawingml/2006/picture">
                   <pic:nvPicPr>
-                    <pic:cNvPr id="0" name="Picture 149" descr="Stripes wielding scissors"/>
+                    <pic:cNvPr id="0" name="Picture 11" descr="Stripes wielding scissors"/>
                     <pic:cNvPicPr>
                       <a:picLocks noChangeAspect="1" noChangeArrowheads="1"/>
                     </pic:cNvPicPr>
                   </pic:nvPicPr>
-                  <pic:blipFill>
+                  <pic:blipFill rotWithShape="1">
                     <a:blip r:embed="rId14" cstate="print">
                       <a:extLst>
                         <a:ext uri="{28A0092B-C50C-407E-A947-70E740481C1C}">
@@ -1008,15 +888,13 @@
                         </a:ext>
                       </a:extLst>
                     </a:blip>
-                    <a:srcRect/>
-                    <a:stretch>
-                      <a:fillRect/>
-                    </a:stretch>
+                    <a:srcRect t="1412" r="33806" b="10711"/>
+                    <a:stretch/>
                   </pic:blipFill>
                   <pic:spPr bwMode="auto">
                     <a:xfrm>
                       <a:off x="0" y="0"/>
-                      <a:ext cx="5943600" cy="3949065"/>
+                      <a:ext cx="3474720" cy="3064325"/>
                     </a:xfrm>
                     <a:prstGeom prst="rect">
                       <a:avLst/>
@@ -1025,6 +903,11 @@
                     <a:ln>
                       <a:noFill/>
                     </a:ln>
+                    <a:extLst>
+                      <a:ext uri="{53640926-AAD7-44D8-BBD7-CCE9431645EC}">
+                        <a14:shadowObscured xmlns:a14="http://schemas.microsoft.com/office/drawing/2010/main"/>
+                      </a:ext>
+                    </a:extLst>
                   </pic:spPr>
                 </pic:pic>
               </a:graphicData>
@@ -1034,7 +917,11 @@
       </w:r>
     </w:p>
     <w:p>
-      <w:r>
+      <w:pPr>
+        <w:pStyle w:val="Heading1"/>
+      </w:pPr>
+      <w:r>
+        <w:lastRenderedPageBreak/>
         <w:t>4</w:t>
       </w:r>
     </w:p>
@@ -1045,38 +932,31 @@
     </w:p>
     <w:p>
       <w:r>
-        <w:t>Francois screamed — something torn and broken, something between a cry and an answer. </w:t>
+        <w:t xml:space="preserve">Francois screamed — something torn and broken, something between a cry and an answer. "I'm not coming </w:t>
       </w:r>
       <w:proofErr w:type="gramStart"/>
       <w:r>
+        <w:t>down,</w:t>
+      </w:r>
+      <w:proofErr w:type="gramEnd"/>
+      <w:r>
+        <w:t xml:space="preserve"> I'm not coming down!" Tom held on. They spun. They crashed. The zebra, impossibly, remained on Tom's head throughout.</w:t>
+      </w:r>
+    </w:p>
+    <w:p>
+      <w:pPr>
+        <w:pStyle w:val="NoSpacing"/>
+      </w:pPr>
+      <w:r>
         <w:rPr>
-          <w:rStyle w:val="Emphasis"/>
+          <w:noProof/>
         </w:rPr>
-        <w:t>”I'm</w:t>
-      </w:r>
-      <w:proofErr w:type="gramEnd"/>
-      <w:r>
-        <w:rPr>
-          <w:rStyle w:val="Emphasis"/>
-        </w:rPr>
-        <w:t xml:space="preserve"> not coming down, I'm not coming down!”</w:t>
-      </w:r>
-      <w:r>
-        <w:t xml:space="preserve"> Tom held on. They spun. They crashed. </w:t>
-      </w:r>
-      <w:r>
-        <w:lastRenderedPageBreak/>
-        <w:t>The zebra, impossibly, remained on Tom's head throughout.</w:t>
-      </w:r>
-    </w:p>
-    <w:p>
-      <w:r>
         <w:lastRenderedPageBreak/>
         <w:drawing>
-          <wp:inline distT="0" distB="0" distL="0" distR="0" wp14:anchorId="1D324649" wp14:editId="21212C5B">
-            <wp:extent cx="5722620" cy="8229600"/>
-            <wp:effectExtent l="0" t="0" r="0" b="0"/>
-            <wp:docPr id="34" name="Picture 34" descr="Tom screaming"/>
+          <wp:inline distT="0" distB="0" distL="0" distR="0" wp14:anchorId="29066F0D" wp14:editId="5BDA90D3">
+            <wp:extent cx="3474720" cy="4056426"/>
+            <wp:effectExtent l="0" t="0" r="0" b="1270"/>
+            <wp:docPr id="2" name="Picture 2" descr="Tom screaming"/>
             <wp:cNvGraphicFramePr>
               <a:graphicFrameLocks xmlns:a="http://schemas.openxmlformats.org/drawingml/2006/main" noChangeAspect="1"/>
             </wp:cNvGraphicFramePr>
@@ -1084,12 +964,12 @@
               <a:graphicData uri="http://schemas.openxmlformats.org/drawingml/2006/picture">
                 <pic:pic xmlns:pic="http://schemas.openxmlformats.org/drawingml/2006/picture">
                   <pic:nvPicPr>
-                    <pic:cNvPr id="0" name="Picture 150" descr="Tom screaming"/>
+                    <pic:cNvPr id="0" name="Picture 12" descr="Tom screaming"/>
                     <pic:cNvPicPr>
                       <a:picLocks noChangeAspect="1" noChangeArrowheads="1"/>
                     </pic:cNvPicPr>
                   </pic:nvPicPr>
-                  <pic:blipFill>
+                  <pic:blipFill rotWithShape="1">
                     <a:blip r:embed="rId15" cstate="print">
                       <a:extLst>
                         <a:ext uri="{28A0092B-C50C-407E-A947-70E740481C1C}">
@@ -1097,15 +977,13 @@
                         </a:ext>
                       </a:extLst>
                     </a:blip>
-                    <a:srcRect/>
-                    <a:stretch>
-                      <a:fillRect/>
-                    </a:stretch>
+                    <a:srcRect l="1396" t="39123" r="43443" b="16096"/>
+                    <a:stretch/>
                   </pic:blipFill>
                   <pic:spPr bwMode="auto">
                     <a:xfrm>
                       <a:off x="0" y="0"/>
-                      <a:ext cx="5722620" cy="8229600"/>
+                      <a:ext cx="3474720" cy="4056426"/>
                     </a:xfrm>
                     <a:prstGeom prst="rect">
                       <a:avLst/>
@@ -1114,6 +992,11 @@
                     <a:ln>
                       <a:noFill/>
                     </a:ln>
+                    <a:extLst>
+                      <a:ext uri="{53640926-AAD7-44D8-BBD7-CCE9431645EC}">
+                        <a14:shadowObscured xmlns:a14="http://schemas.microsoft.com/office/drawing/2010/main"/>
+                      </a:ext>
+                    </a:extLst>
                   </pic:spPr>
                 </pic:pic>
               </a:graphicData>
@@ -1122,125 +1005,82 @@
         </w:drawing>
       </w:r>
     </w:p>
+    <w:p/>
+    <w:p>
+      <w:r>
+        <w:t>Francois's legs went out from under him — the second time that week, and this time there was nothing to hold onto. Tom eased him down. Crouched beside him.</w:t>
+      </w:r>
+    </w:p>
+    <w:p>
+      <w:r>
+        <w:t>"You couldn't confess," he said. "But part of you needed someone to find out."</w:t>
+      </w:r>
+    </w:p>
+    <w:p>
+      <w:r>
+        <w:t>Francois said nothing for a moment.</w:t>
+      </w:r>
+    </w:p>
+    <w:p>
+      <w:r>
+        <w:t>Then something shifted in him — not grief, not defiance. He almost laughed.</w:t>
+      </w:r>
+    </w:p>
     <w:p>
       <w:r>
         <w:lastRenderedPageBreak/>
-        <w:pict w14:anchorId="2CBF30DE">
-          <v:rect id="_x0000_i1251" style="width:0;height:1.5pt" o:hralign="center" o:hrstd="t" o:hr="t" fillcolor="#a0a0a0" stroked="f"/>
-        </w:pict>
-      </w:r>
-    </w:p>
-    <w:p>
-      <w:r>
-        <w:t>Francois's legs went out from under him — the second time that week, and this time there was nothing to hold onto. Tom eased him down. Crouched beside him.</w:t>
-      </w:r>
-    </w:p>
-    <w:p>
-      <w:r>
-        <w:rPr>
-          <w:rStyle w:val="Emphasis"/>
-        </w:rPr>
-        <w:t>“You couldn't confess,”</w:t>
-      </w:r>
-      <w:r>
-        <w:t> he said. </w:t>
-      </w:r>
-      <w:r>
-        <w:rPr>
-          <w:rStyle w:val="Emphasis"/>
-        </w:rPr>
-        <w:t>“But part of you needed someone to find out.”</w:t>
-      </w:r>
-    </w:p>
-    <w:p>
-      <w:r>
-        <w:t>Francois said nothing for a moment.</w:t>
-      </w:r>
-    </w:p>
-    <w:p>
-      <w:r>
-        <w:t>Then something shifted in him — not grief, not defiance. He almost laughed.</w:t>
-      </w:r>
-    </w:p>
-    <w:p>
+        <w:t>"I'm already gone," he said. "Felt that way all along."</w:t>
+      </w:r>
+    </w:p>
+    <w:p>
+      <w:r>
+        <w:t>Tom looked at him for a long time. It wasn't a denial. It wasn't a confirmation. It was the only answer the situation had left room for.</w:t>
+      </w:r>
+    </w:p>
+    <w:p>
+      <w:r>
+        <w:t>Something moved behind Francois's eyes — like a light seen from a very long way away.</w:t>
+      </w:r>
+    </w:p>
+    <w:p>
+      <w:r>
+        <w:t>Then it was gone.</w:t>
+      </w:r>
+    </w:p>
+    <w:p>
+      <w:pPr>
+        <w:pStyle w:val="Heading1"/>
+      </w:pPr>
+      <w:r>
+        <w:lastRenderedPageBreak/>
+        <w:t>5</w:t>
+      </w:r>
+    </w:p>
+    <w:p>
+      <w:proofErr w:type="spellStart"/>
+      <w:r>
+        <w:t>Some time</w:t>
+      </w:r>
+      <w:proofErr w:type="spellEnd"/>
+      <w:r>
+        <w:t xml:space="preserve"> later, Francois lay on a table, strapped at the wrists and ankles.</w:t>
+      </w:r>
+    </w:p>
+    <w:p>
+      <w:r>
+        <w:t xml:space="preserve">The room beyond the observation window was small and clinical. A metal stand beside the table. A single overhead </w:t>
+      </w:r>
       <w:proofErr w:type="gramStart"/>
       <w:r>
-        <w:rPr>
-          <w:rStyle w:val="Emphasis"/>
-        </w:rPr>
-        <w:t>”I'm</w:t>
+        <w:t>light</w:t>
       </w:r>
       <w:proofErr w:type="gramEnd"/>
       <w:r>
-        <w:rPr>
-          <w:rStyle w:val="Emphasis"/>
-        </w:rPr>
-        <w:t xml:space="preserve"> already gone,”</w:t>
-      </w:r>
-      <w:r>
-        <w:t> he said. </w:t>
-      </w:r>
-      <w:proofErr w:type="gramStart"/>
-      <w:r>
-        <w:rPr>
-          <w:rStyle w:val="Emphasis"/>
-        </w:rPr>
-        <w:t>”Felt</w:t>
-      </w:r>
-      <w:proofErr w:type="gramEnd"/>
-      <w:r>
-        <w:rPr>
-          <w:rStyle w:val="Emphasis"/>
-        </w:rPr>
-        <w:t xml:space="preserve"> that way all along.”</w:t>
-      </w:r>
-    </w:p>
-    <w:p>
-      <w:r>
-        <w:t>Tom looked at him for a long time. It wasn't a denial. It wasn't a confirmation. It was the only answer the situation had left room for.</w:t>
-      </w:r>
-    </w:p>
-    <w:p>
-      <w:r>
-        <w:t>Something moved behind Francois's eyes — like a light seen from a very long way away.</w:t>
-      </w:r>
-    </w:p>
-    <w:p>
-      <w:r>
-        <w:t>Then it was gone.</w:t>
-      </w:r>
-    </w:p>
-    <w:p>
-      <w:r>
-        <w:t>5</w:t>
-      </w:r>
-    </w:p>
-    <w:p>
-      <w:proofErr w:type="spellStart"/>
-      <w:r>
-        <w:t>Some time</w:t>
-      </w:r>
-      <w:proofErr w:type="spellEnd"/>
-      <w:r>
-        <w:t xml:space="preserve"> later, Francois lay on a table, strapped at the wrists and ankles.</w:t>
-      </w:r>
-    </w:p>
-    <w:p>
-      <w:r>
-        <w:t xml:space="preserve">The room beyond the observation window was small and clinical. A metal stand beside the table. A single overhead </w:t>
-      </w:r>
-      <w:proofErr w:type="gramStart"/>
-      <w:r>
-        <w:t>light</w:t>
-      </w:r>
-      <w:proofErr w:type="gramEnd"/>
-      <w:r>
         <w:t>. Tom stood on the other side of the glass, hands in his pockets, watching. He thought about a cornered thing finding a crack. A last lit room at the end of a long dark corridor, doing the only thing it could with the time it had left.</w:t>
       </w:r>
     </w:p>
     <w:p>
       <w:r>
-        <w:lastRenderedPageBreak/>
         <w:t>Vivian was dead. That was real, and it was terrible, and nothing that came after would change it. But the boombox was in an evidence locker, sealed, tagged, going nowhere. The album had been censored. Nobody else would find it on a shelf somewhere and think </w:t>
       </w:r>
       <w:r>
@@ -1250,196 +1090,23 @@
         <w:t>just once, just to see.</w:t>
       </w:r>
       <w:r>
-        <w:t> The corruption ended here, in this room, with this man on this table.</w:t>
-      </w:r>
-    </w:p>
-    <w:p>
-      <w:r>
-        <w:t>Someone had made sure of that. The question of who — the man, or the thing the music had made of him — was one Tom suspected he'd be turning over for a long time.</w:t>
-      </w:r>
-    </w:p>
-    <w:p>
-      <w:r>
-        <w:t>Francois turned his head. Found Tom's eyes through the glass.</w:t>
-      </w:r>
-    </w:p>
-    <w:p>
-      <w:r>
-        <w:t>And smiled.</w:t>
-      </w:r>
-    </w:p>
-    <w:p>
-      <w:r>
-        <w:t>He lifted one small striped arm and waved, slow and cheerful, with the complete serenity of a man at peace with every single choice he had ever made. The strap caught him short; the thin tube taped to the crook of his elbow shifted slightly with the motion. When he spoke, his voice came through the speaker above the glass, flat and close, like a voice in a small room.</w:t>
-      </w:r>
-    </w:p>
-    <w:p>
-      <w:r>
-        <w:rPr>
-          <w:rStyle w:val="Emphasis"/>
-        </w:rPr>
-        <w:t>“I don't regret a thing. It was all worth it. I'd do anything — anything — to hear that sound again.”</w:t>
-      </w:r>
-      <w:r>
-        <w:t> His eyes found Tom's through the glass and stayed there. </w:t>
-      </w:r>
-      <w:r>
-        <w:rPr>
-          <w:rStyle w:val="Emphasis"/>
-        </w:rPr>
-        <w:t>“You pressed play,”</w:t>
-      </w:r>
-      <w:r>
-        <w:t> he said. </w:t>
-      </w:r>
-      <w:r>
-        <w:rPr>
-          <w:rStyle w:val="Emphasis"/>
-        </w:rPr>
-        <w:t>“Forty seconds.”</w:t>
-      </w:r>
-      <w:r>
-        <w:t> A pause. The smile didn't change. </w:t>
-      </w:r>
-      <w:proofErr w:type="gramStart"/>
-      <w:r>
-        <w:rPr>
-          <w:rStyle w:val="Emphasis"/>
-        </w:rPr>
-        <w:t>”There's</w:t>
-      </w:r>
-      <w:proofErr w:type="gramEnd"/>
-      <w:r>
-        <w:rPr>
-          <w:rStyle w:val="Emphasis"/>
-        </w:rPr>
-        <w:t xml:space="preserve"> an insect in your ear,”</w:t>
-      </w:r>
-      <w:r>
-        <w:t> he said. </w:t>
-      </w:r>
-      <w:proofErr w:type="gramStart"/>
-      <w:r>
-        <w:rPr>
-          <w:rStyle w:val="Emphasis"/>
-        </w:rPr>
-        <w:t>”If</w:t>
-      </w:r>
-      <w:proofErr w:type="gramEnd"/>
-      <w:r>
-        <w:rPr>
-          <w:rStyle w:val="Emphasis"/>
-        </w:rPr>
-        <w:t xml:space="preserve"> you scratch it, it won't disappear.”</w:t>
-      </w:r>
-    </w:p>
-    <w:p>
-      <w:r>
-        <w:lastRenderedPageBreak/>
-        <w:t>Tom looked at him until he was done looking.</w:t>
-      </w:r>
-    </w:p>
-    <w:p>
-      <w:r>
-        <w:t xml:space="preserve">The corruption, </w:t>
-      </w:r>
-      <w:proofErr w:type="spellStart"/>
-      <w:r>
-        <w:t>revelling</w:t>
-      </w:r>
-      <w:proofErr w:type="spellEnd"/>
-      <w:r>
-        <w:t xml:space="preserve"> to the end. Or a man who had found the only door left open to him, walked through it, and needed Tom to believe the corruption had been in charge the whole time.</w:t>
-      </w:r>
-    </w:p>
-    <w:p>
-      <w:r>
-        <w:t>Impossible to know. That was the point.</w:t>
-      </w:r>
-    </w:p>
-    <w:p>
-      <w:r>
-        <w:t>Tom turned and walked away down the grey corridor. And as he walked, another thought settled over him — quiet, patient, the way the worst thoughts always are. The rumors he'd been hearing for the better part of a year. The reorientation. The ordinary people who became something else. He had always imagined the corrupting force as something out there — something he'd managed to avoid, something he'd been careful around.</w:t>
-      </w:r>
-    </w:p>
-    <w:p>
-      <w:r>
-        <w:t>But he'd pressed play. Forty seconds. And he'd told himself that was nothing, that he'd stopped in time, that he'd felt it move through him and come out the other side clean.</w:t>
-      </w:r>
-    </w:p>
-    <w:p>
-      <w:r>
-        <w:t>He thought about the instinct that had told him to walk away — twenty years of detective work making noise he hadn't listened to. The rumors. Two alarm systems, both going off at once.</w:t>
-      </w:r>
-    </w:p>
-    <w:p>
-      <w:r>
-        <w:t>He thought </w:t>
-      </w:r>
-      <w:r>
-        <w:rPr>
-          <w:rStyle w:val="Emphasis"/>
-        </w:rPr>
-        <w:t>you're not the only one staring at the sun — afraid of what you'd find if you stepped back inside.</w:t>
-      </w:r>
-    </w:p>
-    <w:p>
-      <w:r>
-        <w:lastRenderedPageBreak/>
-        <w:t>He thought: he had not walked away.</w:t>
-      </w:r>
-    </w:p>
-    <w:p>
-      <w:r>
-        <w:t>Then he stopped in the middle of the corridor. Stood very still. Hands in his pockets. Staring at the grey nothing ahead of him.</w:t>
-      </w:r>
-    </w:p>
-    <w:p>
-      <w:r>
-        <w:t>He didn't move.</w:t>
-      </w:r>
-    </w:p>
-    <w:p>
-      <w:r>
-        <w:t>Those weren't his words. He knew it the same way you know a foreign coin in your pocket before you look at it — by its weight, by its edge, by the slight wrongness of it against your fingers. He tried to trace the thought back to where it had come from.</w:t>
-      </w:r>
-    </w:p>
-    <w:p>
-      <w:r>
-        <w:t>Nothing. A gap where the source should be.</w:t>
-      </w:r>
-    </w:p>
-    <w:p>
-      <w:r>
-        <w:t>The question arrived slowly, the way a cold front arrives. Not a dramatic thing. Just a change in the air.</w:t>
-      </w:r>
-    </w:p>
-    <w:p>
-      <w:pPr>
-        <w:rPr>
-          <w:rStyle w:val="Emphasis"/>
-        </w:rPr>
-      </w:pPr>
-      <w:r>
-        <w:rPr>
-          <w:rStyle w:val="Emphasis"/>
-        </w:rPr>
-        <w:t>What if forty seconds wasn't where it started?</w:t>
-      </w:r>
-    </w:p>
-    <w:p>
-      <w:r>
-        <w:t>Behind him, the observation window went dark.</w:t>
-      </w:r>
-    </w:p>
-    <w:p>
+        <w:t xml:space="preserve"> The </w:t>
+      </w:r>
       <w:r>
         <w:lastRenderedPageBreak/>
         <w:drawing>
-          <wp:inline distT="0" distB="0" distL="0" distR="0" wp14:anchorId="3DC28007" wp14:editId="7EF384DC">
-            <wp:extent cx="5486400" cy="8229600"/>
+          <wp:anchor distT="0" distB="0" distL="114300" distR="114300" simplePos="0" relativeHeight="251658240" behindDoc="0" locked="0" layoutInCell="1" allowOverlap="1" wp14:anchorId="70DCEA81" wp14:editId="02CA0A9F">
+            <wp:simplePos x="0" y="0"/>
+            <wp:positionH relativeFrom="column">
+              <wp:posOffset>-87742</wp:posOffset>
+            </wp:positionH>
+            <wp:positionV relativeFrom="paragraph">
+              <wp:posOffset>482</wp:posOffset>
+            </wp:positionV>
+            <wp:extent cx="3474720" cy="6553200"/>
             <wp:effectExtent l="0" t="0" r="0" b="0"/>
-            <wp:docPr id="33" name="Picture 33" descr="Stripes under the blanket"/>
+            <wp:wrapSquare wrapText="bothSides"/>
+            <wp:docPr id="1" name="Picture 1" descr="Stripes under the blanket"/>
             <wp:cNvGraphicFramePr>
               <a:graphicFrameLocks xmlns:a="http://schemas.openxmlformats.org/drawingml/2006/main" noChangeAspect="1"/>
             </wp:cNvGraphicFramePr>
@@ -1447,12 +1114,12 @@
               <a:graphicData uri="http://schemas.openxmlformats.org/drawingml/2006/picture">
                 <pic:pic xmlns:pic="http://schemas.openxmlformats.org/drawingml/2006/picture">
                   <pic:nvPicPr>
-                    <pic:cNvPr id="0" name="Picture 152" descr="Stripes under the blanket"/>
+                    <pic:cNvPr id="0" name="Picture 14" descr="Stripes under the blanket"/>
                     <pic:cNvPicPr>
                       <a:picLocks noChangeAspect="1" noChangeArrowheads="1"/>
                     </pic:cNvPicPr>
                   </pic:nvPicPr>
-                  <pic:blipFill>
+                  <pic:blipFill rotWithShape="1">
                     <a:blip r:embed="rId16" cstate="print">
                       <a:extLst>
                         <a:ext uri="{28A0092B-C50C-407E-A947-70E740481C1C}">
@@ -1460,15 +1127,13 @@
                         </a:ext>
                       </a:extLst>
                     </a:blip>
-                    <a:srcRect/>
-                    <a:stretch>
-                      <a:fillRect/>
-                    </a:stretch>
+                    <a:srcRect l="20486"/>
+                    <a:stretch/>
                   </pic:blipFill>
                   <pic:spPr bwMode="auto">
                     <a:xfrm>
                       <a:off x="0" y="0"/>
-                      <a:ext cx="5486400" cy="8229600"/>
+                      <a:ext cx="3474720" cy="6553200"/>
                     </a:xfrm>
                     <a:prstGeom prst="rect">
                       <a:avLst/>
@@ -1477,19 +1142,165 @@
                     <a:ln>
                       <a:noFill/>
                     </a:ln>
+                    <a:extLst>
+                      <a:ext uri="{53640926-AAD7-44D8-BBD7-CCE9431645EC}">
+                        <a14:shadowObscured xmlns:a14="http://schemas.microsoft.com/office/drawing/2010/main"/>
+                      </a:ext>
+                    </a:extLst>
                   </pic:spPr>
                 </pic:pic>
               </a:graphicData>
             </a:graphic>
-          </wp:inline>
+          </wp:anchor>
         </w:drawing>
       </w:r>
-    </w:p>
-    <w:p>
+      <w:r>
+        <w:t xml:space="preserve">corruption ended here, in this room, with this </w:t>
+      </w:r>
       <w:r>
         <w:lastRenderedPageBreak/>
-        <w:t>6</w:t>
-      </w:r>
+        <w:t>man on this table.</w:t>
+      </w:r>
+    </w:p>
+    <w:p>
+      <w:r>
+        <w:t>Someone had made sure of that. The question of who — the man, or the thing the music had made of him — was one Tom suspected he'd be turning over for a long time.</w:t>
+      </w:r>
+    </w:p>
+    <w:p>
+      <w:r>
+        <w:t>Francois turned his head. Found Tom's eyes through the glass.</w:t>
+      </w:r>
+    </w:p>
+    <w:p>
+      <w:r>
+        <w:t>And smiled.</w:t>
+      </w:r>
+    </w:p>
+    <w:p>
+      <w:r>
+        <w:t>He lifted one small striped arm and waved, slow and cheerful, with the complete serenity of a man at peace with every single choice he had ever made. The strap caught him short; the thin tube taped to the crook of his elbow shifted slightly with the motion. When he spoke, his voice came through the speaker above the glass, flat and close, like a voice in a small room.</w:t>
+      </w:r>
+    </w:p>
+    <w:p>
+      <w:r>
+        <w:t>"I don't regret a thing. It was all worth it. I'd do anything — anything — to hear that sound again." His eyes found Tom's through the glass and stayed there. "You pressed play," he said. "Forty seconds." A pause. The smile didn't change. "There's an insect in your ear," he said. "If you scratch it, it won't disappear."</w:t>
+      </w:r>
+    </w:p>
+    <w:p>
+      <w:r>
+        <w:t>Tom looked at him until he was done looking.</w:t>
+      </w:r>
+    </w:p>
+    <w:p>
+      <w:r>
+        <w:t xml:space="preserve">The corruption, </w:t>
+      </w:r>
+      <w:proofErr w:type="spellStart"/>
+      <w:r>
+        <w:t>revelling</w:t>
+      </w:r>
+      <w:proofErr w:type="spellEnd"/>
+      <w:r>
+        <w:t xml:space="preserve"> to the end. Or a man who had found the only door left open to him, walked through it, and needed Tom to believe the corruption had been in charge the whole time.</w:t>
+      </w:r>
+    </w:p>
+    <w:p>
+      <w:r>
+        <w:lastRenderedPageBreak/>
+        <w:t>Impossible to know. That was the point.</w:t>
+      </w:r>
+    </w:p>
+    <w:p>
+      <w:r>
+        <w:t>Tom turned and walked away down the grey corridor. And as he walked, another thought settled over him — quiet, patient, the way the worst thoughts always are. The rumors he'd been hearing for the better part of a year. The reorientation. The ordinary people who became something else. He had always imagined the corrupting force as something out there — something he'd managed to avoid, something he'd been careful around.</w:t>
+      </w:r>
+      <w:r>
+        <w:t xml:space="preserve"> </w:t>
+      </w:r>
+    </w:p>
+    <w:p>
+      <w:r>
+        <w:t>But he'd pressed play. Forty seconds. And he'd told himself that was nothing, that he'd stopped in time, that he'd felt it move through him and come out the other side clean.</w:t>
+      </w:r>
+    </w:p>
+    <w:p>
+      <w:r>
+        <w:t>He thought about the instinct that had told him to walk away — twenty years of detective work making noise he hadn't listened to. The rumors. Two alarm systems, both going off at once.</w:t>
+      </w:r>
+    </w:p>
+    <w:p>
+      <w:r>
+        <w:t>He thought </w:t>
+      </w:r>
+      <w:r>
+        <w:rPr>
+          <w:rStyle w:val="Emphasis"/>
+        </w:rPr>
+        <w:t>you're not the only one staring at the sun — afraid of what you'd find if you stepped back inside.</w:t>
+      </w:r>
+    </w:p>
+    <w:p>
+      <w:r>
+        <w:t>He thought: he had not walked away.</w:t>
+      </w:r>
+    </w:p>
+    <w:p>
+      <w:r>
+        <w:t>Then he stopped in the middle of the corridor. Stood very still. Hands in his pockets. Staring at the grey nothing ahead of him.</w:t>
+      </w:r>
+    </w:p>
+    <w:p>
+      <w:r>
+        <w:t>He didn't move.</w:t>
+      </w:r>
+    </w:p>
+    <w:p>
+      <w:r>
+        <w:lastRenderedPageBreak/>
+        <w:t>Those weren't his words. He knew it the same way you know a foreign coin in your pocket before you look at it — by its weight, by its edge, by the slight wrongness of it against your fingers. He tried to trace the thought back to where it had come from.</w:t>
+      </w:r>
+    </w:p>
+    <w:p>
+      <w:r>
+        <w:t>Nothing. A gap where the source should be.</w:t>
+      </w:r>
+    </w:p>
+    <w:p>
+      <w:r>
+        <w:t>The question arrived slowly, the way a cold front arrives. Not a dramatic thing. Just a change in the air.</w:t>
+      </w:r>
+    </w:p>
+    <w:p>
+      <w:pPr>
+        <w:rPr>
+          <w:rStyle w:val="Emphasis"/>
+        </w:rPr>
+      </w:pPr>
+      <w:r>
+        <w:rPr>
+          <w:rStyle w:val="Emphasis"/>
+        </w:rPr>
+        <w:t>What if forty seconds wasn't where it started?</w:t>
+      </w:r>
+    </w:p>
+    <w:p>
+      <w:r>
+        <w:t>Behind him, the observation window went dark.</w:t>
+      </w:r>
+    </w:p>
+    <w:p>
+      <w:pPr>
+        <w:pStyle w:val="NoSpacing"/>
+      </w:pPr>
+    </w:p>
+    <w:p>
+      <w:pPr>
+        <w:pStyle w:val="Heading1"/>
+        <w:pBdr>
+          <w:bottom w:val="none" w:sz="0" w:space="0" w:color="auto"/>
+        </w:pBdr>
+      </w:pPr>
     </w:p>
     <w:p>
       <w:pPr>
@@ -1535,46 +1346,6 @@
         <w:t>— FIN —</w:t>
       </w:r>
     </w:p>
-    <w:p>
-      <w:pPr>
-        <w:rPr>
-          <w:rStyle w:val="Emphasis"/>
-        </w:rPr>
-      </w:pPr>
-      <w:r>
-        <w:rPr>
-          <w:rStyle w:val="Emphasis"/>
-        </w:rPr>
-        <w:t>Written by Thomas Butler</w:t>
-      </w:r>
-    </w:p>
-    <w:p>
-      <w:pPr>
-        <w:rPr>
-          <w:rStyle w:val="Emphasis"/>
-        </w:rPr>
-      </w:pPr>
-      <w:r>
-        <w:rPr>
-          <w:rStyle w:val="Emphasis"/>
-        </w:rPr>
-        <w:t>Pictures by Rebecca Stewart</w:t>
-      </w:r>
-    </w:p>
-    <w:p>
-      <w:pPr>
-        <w:rPr>
-          <w:rStyle w:val="Emphasis"/>
-        </w:rPr>
-      </w:pPr>
-      <w:r>
-        <w:rPr>
-          <w:rStyle w:val="Emphasis"/>
-        </w:rPr>
-        <w:t>Edited by Ruth-Ann Butler</w:t>
-      </w:r>
-    </w:p>
-    <w:p/>
     <w:sectPr>
       <w:headerReference w:type="default" r:id="rId17"/>
       <w:type w:val="oddPage"/>
@@ -1651,6 +1422,8 @@
     <w:sdtEndPr>
       <w:rPr>
         <w:noProof/>
+        <w:sz w:val="22"/>
+        <w:szCs w:val="16"/>
       </w:rPr>
     </w:sdtEndPr>
     <w:sdtContent>
@@ -1660,23 +1433,39 @@
           <w:ind w:firstLine="0"/>
         </w:pPr>
         <w:r>
+          <w:rPr>
+            <w:sz w:val="22"/>
+            <w:szCs w:val="16"/>
+          </w:rPr>
           <w:fldChar w:fldCharType="begin"/>
         </w:r>
         <w:r>
+          <w:rPr>
+            <w:sz w:val="22"/>
+            <w:szCs w:val="16"/>
+          </w:rPr>
           <w:instrText xml:space="preserve"> PAGE   \* MERGEFORMAT </w:instrText>
         </w:r>
         <w:r>
+          <w:rPr>
+            <w:sz w:val="22"/>
+            <w:szCs w:val="16"/>
+          </w:rPr>
           <w:fldChar w:fldCharType="separate"/>
         </w:r>
         <w:r>
           <w:rPr>
             <w:noProof/>
+            <w:sz w:val="22"/>
+            <w:szCs w:val="16"/>
           </w:rPr>
           <w:t>2</w:t>
         </w:r>
         <w:r>
           <w:rPr>
             <w:noProof/>
+            <w:sz w:val="22"/>
+            <w:szCs w:val="16"/>
           </w:rPr>
           <w:fldChar w:fldCharType="end"/>
         </w:r>
@@ -1726,6 +1515,8 @@
     <w:sdtEndPr>
       <w:rPr>
         <w:noProof/>
+        <w:sz w:val="20"/>
+        <w:szCs w:val="14"/>
       </w:rPr>
     </w:sdtEndPr>
     <w:sdtContent>
@@ -1735,23 +1526,39 @@
           <w:jc w:val="right"/>
         </w:pPr>
         <w:r>
+          <w:rPr>
+            <w:sz w:val="22"/>
+            <w:szCs w:val="16"/>
+          </w:rPr>
           <w:fldChar w:fldCharType="begin"/>
         </w:r>
         <w:r>
+          <w:rPr>
+            <w:sz w:val="22"/>
+            <w:szCs w:val="16"/>
+          </w:rPr>
           <w:instrText xml:space="preserve"> PAGE   \* MERGEFORMAT </w:instrText>
         </w:r>
         <w:r>
+          <w:rPr>
+            <w:sz w:val="22"/>
+            <w:szCs w:val="16"/>
+          </w:rPr>
           <w:fldChar w:fldCharType="separate"/>
         </w:r>
         <w:r>
           <w:rPr>
             <w:noProof/>
+            <w:sz w:val="22"/>
+            <w:szCs w:val="16"/>
           </w:rPr>
           <w:t>2</w:t>
         </w:r>
         <w:r>
           <w:rPr>
             <w:noProof/>
+            <w:sz w:val="22"/>
+            <w:szCs w:val="16"/>
           </w:rPr>
           <w:fldChar w:fldCharType="end"/>
         </w:r>
@@ -3020,6 +2827,7 @@
         <w:ilvl w:val="1"/>
       </w:numPr>
       <w:spacing w:line="240" w:lineRule="auto"/>
+      <w:ind w:firstLine="432"/>
     </w:pPr>
     <w:rPr>
       <w:rFonts w:asciiTheme="majorHAnsi" w:eastAsiaTheme="majorEastAsia" w:hAnsiTheme="majorHAnsi" w:cstheme="majorBidi"/>

</xml_diff>

<commit_message>
edit Forty Seconds: trim opening, revise chapters 4-5, rewrite colophon
Prompt: "commit everything"

Co-Authored-By: Claude Opus 4.6 <noreply@anthropic.com>
</commit_message>
<xml_diff>
--- a/stories/detective_noir/Forty Seconds.docx
+++ b/stories/detective_noir/Forty Seconds.docx
@@ -180,21 +180,6 @@
     </w:p>
     <w:p>
       <w:pPr>
-        <w:pStyle w:val="HalfTitle"/>
-        <w:sectPr>
-          <w:headerReference w:type="even" r:id="rId7"/>
-          <w:headerReference w:type="default" r:id="rId8"/>
-          <w:type w:val="oddPage"/>
-          <w:pgSz w:w="7920" w:h="12240"/>
-          <w:pgMar w:top="720" w:right="900" w:bottom="720" w:left="720" w:header="432" w:footer="0" w:gutter="360"/>
-          <w:pgNumType w:start="1"/>
-          <w:cols w:space="720"/>
-          <w:docGrid w:linePitch="360"/>
-        </w:sectPr>
-      </w:pPr>
-    </w:p>
-    <w:p>
-      <w:pPr>
         <w:pStyle w:val="SectionHeader"/>
       </w:pPr>
       <w:proofErr w:type="gramStart"/>
@@ -488,6 +473,7 @@
       <w:pPr>
         <w:pStyle w:val="AlsoByTitle"/>
         <w:sectPr>
+          <w:headerReference w:type="default" r:id="rId7"/>
           <w:pgSz w:w="7920" w:h="12240"/>
           <w:pgMar w:top="720" w:right="900" w:bottom="720" w:left="720" w:header="288" w:footer="0" w:gutter="360"/>
           <w:pgNumType w:start="1"/>
@@ -865,9 +851,9 @@
     <w:p>
       <w:pPr>
         <w:pStyle w:val="Heading1"/>
-        <w:spacing w:after="0"/>
+        <w:spacing w:after="5600"/>
         <w:sectPr>
-          <w:headerReference w:type="default" r:id="rId9"/>
+          <w:headerReference w:type="default" r:id="rId8"/>
           <w:type w:val="oddPage"/>
           <w:pgSz w:w="7920" w:h="12240"/>
           <w:pgMar w:top="720" w:right="900" w:bottom="720" w:left="720" w:header="288" w:footer="0" w:gutter="360"/>
@@ -884,15 +870,12 @@
     </w:p>
     <w:p>
       <w:r>
-        <w:t>It was a Monday like any Monday. 1997. Grey sky, grey city, grey coffee going cold on the counter. The city had been running a low fever for months — nothing you could point to exactly, nothing that would hold still long enough to diagnose. Just a dull, persistent wrongness that settled into the air like weather and refused to move on. People felt it. Nobody said anything. That was how it always started, in Tom's experience: everybody feeling the same thing, nobody wanting to be the one who named it first.</w:t>
-      </w:r>
-      <w:r>
-        <w:t xml:space="preserve"> </w:t>
-      </w:r>
-    </w:p>
-    <w:p>
-      <w:r>
-        <w:t>Francois had been away for the weekend — business, he'd say later, though nobody asked twice. He came back on a Sunday night, coat damp from the rain, key in the lock, the ordinary machinery of return. He stepped inside. He looked at the door to the next room.</w:t>
+        <w:t xml:space="preserve">It was a Monday like any Monday. 1997. Grey sky, grey city, grey coffee going cold on the counter. </w:t>
+      </w:r>
+    </w:p>
+    <w:p>
+      <w:r>
+        <w:t>Francois had been away for the weekend — business, he'd say later, though nobody asked twice. He stepped inside. He looked at the door to the next room.</w:t>
       </w:r>
     </w:p>
     <w:p>
@@ -906,19 +889,19 @@
         <w:t>fundamentally wrong</w:t>
       </w:r>
       <w:r>
-        <w:t xml:space="preserve"> in a way that a man feels in his chest before his brain has caught up.</w:t>
-      </w:r>
-      <w:r>
-        <w:t xml:space="preserve"> </w:t>
-      </w:r>
-    </w:p>
-    <w:p>
+        <w:t xml:space="preserve"> in a way that a man feels in his chest before his brain has caught up. </w:t>
+      </w:r>
+    </w:p>
+    <w:p>
+      <w:pPr>
+        <w:pStyle w:val="Photo"/>
+      </w:pPr>
       <w:r>
         <w:lastRenderedPageBreak/>
         <w:drawing>
-          <wp:inline distT="0" distB="0" distL="0" distR="0" wp14:anchorId="57F7512D" wp14:editId="7817EB9C">
-            <wp:extent cx="3771900" cy="6483350"/>
-            <wp:effectExtent l="0" t="0" r="0" b="0"/>
+          <wp:inline distT="0" distB="0" distL="0" distR="0" wp14:anchorId="750CC6A3" wp14:editId="5EE4F7CD">
+            <wp:extent cx="3995928" cy="6868422"/>
+            <wp:effectExtent l="0" t="0" r="5080" b="8890"/>
             <wp:docPr id="8" name="Picture 8" descr="Stripes clinging to the bedpost"/>
             <wp:cNvGraphicFramePr>
               <a:graphicFrameLocks xmlns:a="http://schemas.openxmlformats.org/drawingml/2006/main" noChangeAspect="1"/>
@@ -933,7 +916,7 @@
                     </pic:cNvPicPr>
                   </pic:nvPicPr>
                   <pic:blipFill rotWithShape="1">
-                    <a:blip r:embed="rId10" cstate="print">
+                    <a:blip r:embed="rId9" cstate="print">
                       <a:extLst>
                         <a:ext uri="{28A0092B-C50C-407E-A947-70E740481C1C}">
                           <a14:useLocalDpi xmlns:a14="http://schemas.microsoft.com/office/drawing/2010/main" val="0"/>
@@ -946,7 +929,7 @@
                   <pic:spPr bwMode="auto">
                     <a:xfrm>
                       <a:off x="0" y="0"/>
-                      <a:ext cx="3771900" cy="6483350"/>
+                      <a:ext cx="3995928" cy="6868422"/>
                     </a:xfrm>
                     <a:prstGeom prst="rect">
                       <a:avLst/>
@@ -971,10 +954,7 @@
     <w:p>
       <w:r>
         <w:lastRenderedPageBreak/>
-        <w:t>Francois's legs went out from under him. He grabbed the nearest bedpost and held on like a man clinging to a life raft in a black ocean.</w:t>
-      </w:r>
-      <w:r>
-        <w:t xml:space="preserve"> </w:t>
+        <w:t xml:space="preserve">Francois's legs went out from under him. He grabbed the nearest bedpost and held on like a man clinging to a life raft in a black ocean. </w:t>
       </w:r>
     </w:p>
     <w:p>
@@ -998,12 +978,15 @@
       </w:r>
     </w:p>
     <w:p>
+      <w:pPr>
+        <w:pStyle w:val="Photo"/>
+      </w:pPr>
       <w:r>
         <w:lastRenderedPageBreak/>
         <w:drawing>
-          <wp:inline distT="0" distB="0" distL="0" distR="0" wp14:anchorId="79419B4A" wp14:editId="6DB892E1">
-            <wp:extent cx="3771900" cy="6433395"/>
-            <wp:effectExtent l="0" t="0" r="0" b="5715"/>
+          <wp:inline distT="0" distB="0" distL="0" distR="0" wp14:anchorId="1369BD05" wp14:editId="66C1E55D">
+            <wp:extent cx="3995928" cy="6815500"/>
+            <wp:effectExtent l="0" t="0" r="5080" b="4445"/>
             <wp:docPr id="7" name="Picture 7" descr="Vivian Plume face down on the carpet"/>
             <wp:cNvGraphicFramePr>
               <a:graphicFrameLocks xmlns:a="http://schemas.openxmlformats.org/drawingml/2006/main" noChangeAspect="1"/>
@@ -1018,7 +1001,7 @@
                     </pic:cNvPicPr>
                   </pic:nvPicPr>
                   <pic:blipFill rotWithShape="1">
-                    <a:blip r:embed="rId11" cstate="print">
+                    <a:blip r:embed="rId10" cstate="print">
                       <a:extLst>
                         <a:ext uri="{28A0092B-C50C-407E-A947-70E740481C1C}">
                           <a14:useLocalDpi xmlns:a14="http://schemas.microsoft.com/office/drawing/2010/main" val="0"/>
@@ -1031,7 +1014,7 @@
                   <pic:spPr bwMode="auto">
                     <a:xfrm>
                       <a:off x="0" y="0"/>
-                      <a:ext cx="3771900" cy="6433395"/>
+                      <a:ext cx="3995928" cy="6815500"/>
                     </a:xfrm>
                     <a:prstGeom prst="rect">
                       <a:avLst/>
@@ -1082,7 +1065,7 @@
     <w:p>
       <w:pPr>
         <w:sectPr>
-          <w:headerReference w:type="even" r:id="rId12"/>
+          <w:headerReference w:type="even" r:id="rId11"/>
           <w:type w:val="continuous"/>
           <w:pgSz w:w="7920" w:h="12240"/>
           <w:pgMar w:top="720" w:right="900" w:bottom="720" w:left="720" w:header="288" w:footer="0" w:gutter="360"/>
@@ -1109,6 +1092,134 @@
     </w:p>
     <w:p>
       <w:pPr>
+        <w:sectPr>
+          <w:headerReference w:type="even" r:id="rId12"/>
+          <w:type w:val="continuous"/>
+          <w:pgSz w:w="7920" w:h="12240"/>
+          <w:pgMar w:top="720" w:right="900" w:bottom="720" w:left="720" w:header="288" w:footer="0" w:gutter="360"/>
+          <w:pgNumType w:start="6"/>
+          <w:cols w:space="720"/>
+          <w:titlePg/>
+          <w:docGrid w:linePitch="381"/>
+        </w:sectPr>
+      </w:pPr>
+    </w:p>
+    <w:p>
+      <w:r>
+        <w:t>Tom heard him out without expression. Then he said no.</w:t>
+      </w:r>
+    </w:p>
+    <w:p>
+      <w:r>
+        <w:t>Francois asked why.</w:t>
+      </w:r>
+    </w:p>
+    <w:p>
+      <w:r>
+        <w:t xml:space="preserve">Tom didn't answer that. What he didn't say — what he wouldn't say to a client, or a stranger, or frankly anyone — was that he'd been hearing things for the better part of a year. Whispers, mostly. The kind that </w:t>
+      </w:r>
+      <w:proofErr w:type="gramStart"/>
+      <w:r>
+        <w:t>travel</w:t>
+      </w:r>
+      <w:proofErr w:type="gramEnd"/>
+      <w:r>
+        <w:t xml:space="preserve"> through the back channels of the city, cop to cop, case to cold case, spoken quietly over bad coffee in rooms with the door closed. Something was going </w:t>
+      </w:r>
+      <w:r>
+        <w:lastRenderedPageBreak/>
+        <w:t>around. Something that got into people. Not a sickness, not exactly — more like a </w:t>
+      </w:r>
+      <w:r>
+        <w:rPr>
+          <w:rStyle w:val="Emphasis"/>
+        </w:rPr>
+        <w:t>reorientation.</w:t>
+      </w:r>
+      <w:r>
+        <w:t> Men and women who by all accounts had been perfectly ordinary, perfectly decent, until one day they simply weren't anymore. The ones who could still talk afterwards struggled to describe the before and after. The ones who couldn't talk anymore were the ones who kept Tom up at night. He glanced at Francois — the too-wide eyes, the hands clasped just a little too tight.</w:t>
+      </w:r>
+    </w:p>
+    <w:p>
+      <w:r>
+        <w:t>He'd steered clear of anything that smelled like it for months. And something about the shape of this case — a senseless death, a man clinging to furniture, eyes that were just slightly too wide — smelled exactly like it.</w:t>
+      </w:r>
+    </w:p>
+    <w:p>
+      <w:proofErr w:type="gramStart"/>
+      <w:r>
+        <w:t>So</w:t>
+      </w:r>
+      <w:proofErr w:type="gramEnd"/>
+      <w:r>
+        <w:t xml:space="preserve"> he said no.</w:t>
+      </w:r>
+    </w:p>
+    <w:p>
+      <w:r>
+        <w:t>But Francois was persistent. He leaned in, voice low and urgent, chipping away — planting small seeds of doubt, little splinters of argument that lodged themselves just under the skin — "What if the police botch it? What if justice is never served? Where is the hope, and where is the faith? What if the truth just disappears, like she did?"</w:t>
+      </w:r>
+    </w:p>
+    <w:p>
+      <w:r>
+        <w:t>He stopped. "Don't try too hard to think," he said. "Don't —" He paused. Seemed to lose it briefly. "If there's an order in all of this disorder — I just need to know what it is."</w:t>
+      </w:r>
+    </w:p>
+    <w:p>
+      <w:r>
+        <w:t>Then, just for a moment — half a second, maybe less — something crossed his face. Not grief, not urgency. Something that looked, just briefly, almost like terror. Then it was gone, and he was back, hands clasped, eyes searching Tom's face like nothing had happened.</w:t>
+      </w:r>
+    </w:p>
+    <w:p>
+      <w:r>
+        <w:lastRenderedPageBreak/>
+        <w:t>Tom filed it away — the thing he couldn't name. He'd spent twenty years developing an instinct, and the instinct was making noise. Francois said all the right things in all the right order, and his devastation seemed genuine, and none of that stopped the quiet alarm going off somewhere below Tom's conscious mind. A man in genuine shock didn't argue this well. A man in genuine shock didn't land his points this cleanly. Tom had the distinct and unverifiable sense of being steered.</w:t>
+      </w:r>
+    </w:p>
+    <w:p>
+      <w:r>
+        <w:t>The other thing — smaller, harder to name — was the rhythm of some of it. The phrasing. Every so often Francois would say something and it would scan differently — like he was receiving the words rather than choosing them. Too even. A little too complete. Like a line from a song, almost — like it had a life that predated the conversation it arrived in.</w:t>
+      </w:r>
+    </w:p>
+    <w:p>
+      <w:r>
+        <w:t>He should have walked away. He knew he should have walked away.</w:t>
+      </w:r>
+    </w:p>
+    <w:p>
+      <w:r>
+        <w:t>"He just needs to know who did this," Francois said. "Francois deserves that much."</w:t>
+      </w:r>
+      <w:r>
+        <w:t xml:space="preserve"> </w:t>
+      </w:r>
+    </w:p>
+    <w:p>
+      <w:pPr>
+        <w:pStyle w:val="Photo"/>
+      </w:pPr>
+    </w:p>
+    <w:p>
+      <w:r>
+        <w:t>Tom sat with his fist pressed hard against his chin, eyes fixed on the middle distance. Two alarm systems going off at once. The instinct. The rumors. He turned the shape of the thing over, looking for the angle that held, looking for the solid ground of reason in a conversation that kept moving the floor on him.</w:t>
+      </w:r>
+    </w:p>
+    <w:p>
+      <w:r>
+        <w:t>Finally, something gave.</w:t>
+      </w:r>
+    </w:p>
+    <w:p>
+      <w:r>
+        <w:t>"Fine," he said. "But I do this my way."</w:t>
+      </w:r>
+      <w:r>
+        <w:t xml:space="preserve"> </w:t>
+      </w:r>
+    </w:p>
+    <w:p>
+      <w:pPr>
+        <w:pStyle w:val="Photo"/>
         <w:sectPr>
           <w:headerReference w:type="even" r:id="rId13"/>
           <w:type w:val="continuous"/>
@@ -1120,140 +1231,12 @@
           <w:docGrid w:linePitch="381"/>
         </w:sectPr>
       </w:pPr>
-    </w:p>
-    <w:p>
-      <w:r>
-        <w:t>Tom heard him out without expression. Then he said no.</w:t>
-      </w:r>
-    </w:p>
-    <w:p>
-      <w:r>
-        <w:t>Francois asked why.</w:t>
-      </w:r>
-    </w:p>
-    <w:p>
-      <w:r>
-        <w:t xml:space="preserve">Tom didn't answer that. What he didn't say — what he wouldn't say to a client, or a stranger, or frankly anyone — was that he'd been hearing things for the better part of a year. Whispers, mostly. The kind that </w:t>
-      </w:r>
-      <w:proofErr w:type="gramStart"/>
-      <w:r>
-        <w:t>travel</w:t>
-      </w:r>
-      <w:proofErr w:type="gramEnd"/>
-      <w:r>
-        <w:t xml:space="preserve"> through the back channels of the city, cop to cop, case to cold case, spoken quietly over bad coffee in rooms with the door closed. Something was going </w:t>
-      </w:r>
-      <w:r>
-        <w:lastRenderedPageBreak/>
-        <w:t>around. Something that got into people. Not a sickness, not exactly — more like a </w:t>
-      </w:r>
-      <w:r>
-        <w:rPr>
-          <w:rStyle w:val="Emphasis"/>
-        </w:rPr>
-        <w:t>reorientation.</w:t>
-      </w:r>
-      <w:r>
-        <w:t> Men and women who by all accounts had been perfectly ordinary, perfectly decent, until one day they simply weren't anymore. The ones who could still talk afterwards struggled to describe the before and after. The ones who couldn't talk anymore were the ones who kept Tom up at night. He glanced at Francois — the too-wide eyes, the hands clasped just a little too tight.</w:t>
-      </w:r>
-    </w:p>
-    <w:p>
-      <w:r>
-        <w:t>He'd steered clear of anything that smelled like it for months. And something about the shape of this case — a senseless death, a man clinging to furniture, eyes that were just slightly too wide — smelled exactly like it.</w:t>
-      </w:r>
-    </w:p>
-    <w:p>
-      <w:proofErr w:type="gramStart"/>
-      <w:r>
-        <w:t>So</w:t>
-      </w:r>
-      <w:proofErr w:type="gramEnd"/>
-      <w:r>
-        <w:t xml:space="preserve"> he said no.</w:t>
-      </w:r>
-    </w:p>
-    <w:p>
-      <w:r>
-        <w:t>But Francois was persistent. He leaned in, voice low and urgent, chipping away — planting small seeds of doubt, little splinters of argument that lodged themselves just under the skin — "What if the police botch it? What if justice is never served? Where is the hope, and where is the faith? What if the truth just disappears, like she did?"</w:t>
-      </w:r>
-    </w:p>
-    <w:p>
-      <w:r>
-        <w:t>He stopped. "Don't try too hard to think," he said. "Don't —" He paused. Seemed to lose it briefly. "If there's an order in all of this disorder — I just need to know what it is."</w:t>
-      </w:r>
-    </w:p>
-    <w:p>
-      <w:r>
-        <w:t>Then, just for a moment — half a second, maybe less — something crossed his face. Not grief, not urgency. Something that looked, just briefly, almost like terror. Then it was gone, and he was back, hands clasped, eyes searching Tom's face like nothing had happened.</w:t>
-      </w:r>
-    </w:p>
-    <w:p>
-      <w:r>
-        <w:lastRenderedPageBreak/>
-        <w:t>Tom filed it away — the thing he couldn't name. He'd spent twenty years developing an instinct, and the instinct was making noise. Francois said all the right things in all the right order, and his devastation seemed genuine, and none of that stopped the quiet alarm going off somewhere below Tom's conscious mind. A man in genuine shock didn't argue this well. A man in genuine shock didn't land his points this cleanly. Tom had the distinct and unverifiable sense of being steered.</w:t>
-      </w:r>
-    </w:p>
-    <w:p>
-      <w:r>
-        <w:t>The other thing — smaller, harder to name — was the rhythm of some of it. The phrasing. Every so often Francois would say something and it would scan differently — like he was receiving the words rather than choosing them. Too even. A little too complete. Like a line from a song, almost — like it had a life that predated the conversation it arrived in.</w:t>
-      </w:r>
-    </w:p>
-    <w:p>
-      <w:r>
-        <w:t>He should have walked away. He knew he should have walked away.</w:t>
-      </w:r>
-    </w:p>
-    <w:p>
-      <w:r>
-        <w:t>"He just needs to know who did this," Francois said. "Francois deserves that much."</w:t>
-      </w:r>
-      <w:r>
-        <w:t xml:space="preserve"> </w:t>
-      </w:r>
-    </w:p>
-    <w:p>
-      <w:pPr>
-        <w:pStyle w:val="Photo"/>
-      </w:pPr>
-    </w:p>
-    <w:p>
-      <w:r>
-        <w:t>Tom sat with his fist pressed hard against his chin, eyes fixed on the middle distance. Two alarm systems going off at once. The instinct. The rumors. He turned the shape of the thing over, looking for the angle that held, looking for the solid ground of reason in a conversation that kept moving the floor on him.</w:t>
-      </w:r>
-    </w:p>
-    <w:p>
-      <w:r>
-        <w:t>Finally, something gave.</w:t>
-      </w:r>
-    </w:p>
-    <w:p>
-      <w:r>
-        <w:t>"Fine," he said. "But I do this my way."</w:t>
-      </w:r>
-      <w:r>
-        <w:t xml:space="preserve"> </w:t>
-      </w:r>
-    </w:p>
-    <w:p>
-      <w:pPr>
-        <w:pStyle w:val="Photo"/>
-        <w:sectPr>
-          <w:headerReference w:type="even" r:id="rId14"/>
-          <w:type w:val="continuous"/>
-          <w:pgSz w:w="7920" w:h="12240"/>
-          <w:pgMar w:top="720" w:right="900" w:bottom="720" w:left="720" w:header="288" w:footer="0" w:gutter="360"/>
-          <w:pgNumType w:start="6"/>
-          <w:cols w:space="720"/>
-          <w:titlePg/>
-          <w:docGrid w:linePitch="381"/>
-        </w:sectPr>
-      </w:pPr>
       <w:r>
         <w:lastRenderedPageBreak/>
         <w:drawing>
-          <wp:inline distT="0" distB="0" distL="0" distR="0" wp14:anchorId="72E0D00B" wp14:editId="0EFB9981">
-            <wp:extent cx="3771900" cy="5490845"/>
-            <wp:effectExtent l="0" t="0" r="0" b="0"/>
+          <wp:inline distT="0" distB="0" distL="0" distR="0" wp14:anchorId="413C082A" wp14:editId="3FFD0262">
+            <wp:extent cx="3995928" cy="5816968"/>
+            <wp:effectExtent l="0" t="0" r="5080" b="0"/>
             <wp:docPr id="6" name="Picture 6" descr="Tom fist to chin"/>
             <wp:cNvGraphicFramePr>
               <a:graphicFrameLocks xmlns:a="http://schemas.openxmlformats.org/drawingml/2006/main" noChangeAspect="1"/>
@@ -1268,7 +1251,7 @@
                     </pic:cNvPicPr>
                   </pic:nvPicPr>
                   <pic:blipFill rotWithShape="1">
-                    <a:blip r:embed="rId15" cstate="print">
+                    <a:blip r:embed="rId14" cstate="print">
                       <a:extLst>
                         <a:ext uri="{28A0092B-C50C-407E-A947-70E740481C1C}">
                           <a14:useLocalDpi xmlns:a14="http://schemas.microsoft.com/office/drawing/2010/main" val="0"/>
@@ -1281,7 +1264,7 @@
                   <pic:spPr bwMode="auto">
                     <a:xfrm>
                       <a:off x="0" y="0"/>
-                      <a:ext cx="3771900" cy="5490845"/>
+                      <a:ext cx="3995928" cy="5816968"/>
                     </a:xfrm>
                     <a:prstGeom prst="rect">
                       <a:avLst/>
@@ -1313,7 +1296,7 @@
         <w:pStyle w:val="Heading1"/>
         <w:spacing w:after="6600"/>
         <w:sectPr>
-          <w:headerReference w:type="even" r:id="rId16"/>
+          <w:headerReference w:type="even" r:id="rId15"/>
           <w:type w:val="continuous"/>
           <w:pgSz w:w="7920" w:h="12240"/>
           <w:pgMar w:top="720" w:right="900" w:bottom="720" w:left="720" w:header="288" w:footer="0" w:gutter="360"/>
@@ -1411,7 +1394,7 @@
       <w:r>
         <w:lastRenderedPageBreak/>
         <w:drawing>
-          <wp:inline distT="0" distB="0" distL="0" distR="0" wp14:anchorId="042A1517" wp14:editId="0CFF7013">
+          <wp:inline distT="0" distB="0" distL="0" distR="0" wp14:anchorId="4CEBCE77" wp14:editId="0D5C9170">
             <wp:extent cx="3995928" cy="5567923"/>
             <wp:effectExtent l="0" t="0" r="5080" b="0"/>
             <wp:docPr id="5" name="Picture 5" descr="Stripes on the boombox"/>
@@ -1428,7 +1411,7 @@
                     </pic:cNvPicPr>
                   </pic:nvPicPr>
                   <pic:blipFill rotWithShape="1">
-                    <a:blip r:embed="rId17" cstate="print">
+                    <a:blip r:embed="rId16" cstate="print">
                       <a:extLst>
                         <a:ext uri="{28A0092B-C50C-407E-A947-70E740481C1C}">
                           <a14:useLocalDpi xmlns:a14="http://schemas.microsoft.com/office/drawing/2010/main" val="0"/>
@@ -1517,13 +1500,23 @@
       <w:pPr>
         <w:pStyle w:val="Photo"/>
       </w:pPr>
+    </w:p>
+    <w:p>
+      <w:pPr>
+        <w:pStyle w:val="Photo"/>
+      </w:pPr>
+    </w:p>
+    <w:p>
+      <w:pPr>
+        <w:pStyle w:val="Photo"/>
+      </w:pPr>
       <w:r>
         <w:lastRenderedPageBreak/>
         <w:drawing>
-          <wp:inline distT="0" distB="0" distL="0" distR="0" wp14:anchorId="55D1B989" wp14:editId="23007A85">
-            <wp:extent cx="3995928" cy="3206199"/>
-            <wp:effectExtent l="0" t="0" r="5080" b="0"/>
-            <wp:docPr id="4" name="Picture 4" descr="Stripes strangling Vivian Plume"/>
+          <wp:inline distT="0" distB="0" distL="0" distR="0" wp14:anchorId="42B41F62" wp14:editId="67085341">
+            <wp:extent cx="3994488" cy="2780714"/>
+            <wp:effectExtent l="0" t="0" r="6350" b="635"/>
+            <wp:docPr id="9" name="Picture 9"/>
             <wp:cNvGraphicFramePr>
               <a:graphicFrameLocks xmlns:a="http://schemas.openxmlformats.org/drawingml/2006/main" noChangeAspect="1"/>
             </wp:cNvGraphicFramePr>
@@ -1531,26 +1524,26 @@
               <a:graphicData uri="http://schemas.openxmlformats.org/drawingml/2006/picture">
                 <pic:pic xmlns:pic="http://schemas.openxmlformats.org/drawingml/2006/picture">
                   <pic:nvPicPr>
-                    <pic:cNvPr id="0" name="Picture 10" descr="Stripes strangling Vivian Plume"/>
+                    <pic:cNvPr id="0" name="Picture 1"/>
                     <pic:cNvPicPr>
                       <a:picLocks noChangeAspect="1" noChangeArrowheads="1"/>
                     </pic:cNvPicPr>
                   </pic:nvPicPr>
                   <pic:blipFill rotWithShape="1">
-                    <a:blip r:embed="rId18" cstate="print">
+                    <a:blip r:embed="rId17" cstate="print">
                       <a:extLst>
                         <a:ext uri="{28A0092B-C50C-407E-A947-70E740481C1C}">
                           <a14:useLocalDpi xmlns:a14="http://schemas.microsoft.com/office/drawing/2010/main" val="0"/>
                         </a:ext>
                       </a:extLst>
                     </a:blip>
-                    <a:srcRect l="16161" t="22413" r="19887"/>
+                    <a:srcRect l="16727" t="27265" r="14736" b="745"/>
                     <a:stretch/>
                   </pic:blipFill>
                   <pic:spPr bwMode="auto">
                     <a:xfrm>
                       <a:off x="0" y="0"/>
-                      <a:ext cx="3995928" cy="3206199"/>
+                      <a:ext cx="3995928" cy="2781717"/>
                     </a:xfrm>
                     <a:prstGeom prst="rect">
                       <a:avLst/>
@@ -1594,20 +1587,22 @@
     </w:p>
     <w:p>
       <w:r>
-        <w:t>He already knew, of course. He'd pressed play. He'd felt the corruption move through him like cold water — forty seconds of it, quiet and patient and rewriting things. He understood exactly what had entered Francois's mind.</w:t>
-      </w:r>
-    </w:p>
-    <w:p>
-      <w:r>
-        <w:t xml:space="preserve">And then, because he was the kind of detective who couldn't leave a loose thread, he asked the question that </w:t>
-      </w:r>
+        <w:t>Vivian Plume had been strangled in the next room while her list sat in a desk drawer.</w:t>
+      </w:r>
+    </w:p>
+    <w:p>
+      <w:r>
+        <w:t>He already knew. He'd pressed play. He'd felt the corruption move through him like cold water — forty seconds of it, quiet and patient and rewriting things. He understood exactly what had entered Francois's mind.</w:t>
+      </w:r>
+    </w:p>
+    <w:p>
+      <w:r>
+        <w:t>And then, because he was the kind of detective who couldn't leave a loose thread, he asked the question that had been sitting at the back of his mind since the very first day.</w:t>
+      </w:r>
+    </w:p>
+    <w:p>
       <w:r>
         <w:lastRenderedPageBreak/>
-        <w:t>had been sitting at the back of his mind since the very first day.</w:t>
-      </w:r>
-    </w:p>
-    <w:p>
-      <w:r>
         <w:t>"Then why," he said slowly, "did you hire me?"</w:t>
       </w:r>
     </w:p>
@@ -1651,16 +1646,16 @@
     <w:p>
       <w:proofErr w:type="gramStart"/>
       <w:r>
+        <w:t>So</w:t>
+      </w:r>
+      <w:proofErr w:type="gramEnd"/>
+      <w:r>
+        <w:t xml:space="preserve"> it would have to find another way in.</w:t>
+      </w:r>
+    </w:p>
+    <w:p>
+      <w:r>
         <w:lastRenderedPageBreak/>
-        <w:t>So</w:t>
-      </w:r>
-      <w:proofErr w:type="gramEnd"/>
-      <w:r>
-        <w:t xml:space="preserve"> it would have to find another way in.</w:t>
-      </w:r>
-    </w:p>
-    <w:p>
-      <w:r>
         <w:t>Francois turned from the window. He looked at Tom's face. Whatever he saw there, he didn't wait for the sentence that was coming.</w:t>
       </w:r>
     </w:p>
@@ -1699,7 +1694,7 @@
       <w:pPr>
         <w:pStyle w:val="Photo"/>
         <w:sectPr>
-          <w:headerReference w:type="even" r:id="rId19"/>
+          <w:headerReference w:type="even" r:id="rId18"/>
           <w:type w:val="continuous"/>
           <w:pgSz w:w="7920" w:h="12240"/>
           <w:pgMar w:top="720" w:right="900" w:bottom="720" w:left="720" w:header="288" w:footer="0" w:gutter="360"/>
@@ -1711,7 +1706,7 @@
       </w:pPr>
       <w:r>
         <w:drawing>
-          <wp:inline distT="0" distB="0" distL="0" distR="0" wp14:anchorId="69C7975B" wp14:editId="2E166061">
+          <wp:inline distT="0" distB="0" distL="0" distR="0" wp14:anchorId="06F79669" wp14:editId="63520047">
             <wp:extent cx="3995928" cy="3523975"/>
             <wp:effectExtent l="0" t="0" r="5080" b="635"/>
             <wp:docPr id="3" name="Picture 3" descr="Stripes wielding scissors"/>
@@ -1728,7 +1723,7 @@
                     </pic:cNvPicPr>
                   </pic:nvPicPr>
                   <pic:blipFill rotWithShape="1">
-                    <a:blip r:embed="rId20" cstate="print">
+                    <a:blip r:embed="rId19" cstate="print">
                       <a:extLst>
                         <a:ext uri="{28A0092B-C50C-407E-A947-70E740481C1C}">
                           <a14:useLocalDpi xmlns:a14="http://schemas.microsoft.com/office/drawing/2010/main" val="0"/>
@@ -1773,7 +1768,7 @@
         <w:pStyle w:val="Heading1"/>
         <w:spacing w:after="7000"/>
         <w:sectPr>
-          <w:headerReference w:type="default" r:id="rId21"/>
+          <w:headerReference w:type="default" r:id="rId20"/>
           <w:type w:val="continuous"/>
           <w:pgSz w:w="7920" w:h="12240"/>
           <w:pgMar w:top="720" w:right="900" w:bottom="720" w:left="720" w:header="288" w:footer="0" w:gutter="360"/>
@@ -1813,7 +1808,7 @@
       </w:pPr>
       <w:r>
         <w:drawing>
-          <wp:inline distT="0" distB="0" distL="0" distR="0" wp14:anchorId="29066F0D" wp14:editId="3147D673">
+          <wp:inline distT="0" distB="0" distL="0" distR="0" wp14:anchorId="5BE17E3B" wp14:editId="74B4807C">
             <wp:extent cx="3995928" cy="4664890"/>
             <wp:effectExtent l="0" t="0" r="5080" b="2540"/>
             <wp:docPr id="2" name="Picture 2" descr="Tom screaming"/>
@@ -1830,7 +1825,7 @@
                     </pic:cNvPicPr>
                   </pic:nvPicPr>
                   <pic:blipFill rotWithShape="1">
-                    <a:blip r:embed="rId22" cstate="print">
+                    <a:blip r:embed="rId21" cstate="print">
                       <a:extLst>
                         <a:ext uri="{28A0092B-C50C-407E-A947-70E740481C1C}">
                           <a14:useLocalDpi xmlns:a14="http://schemas.microsoft.com/office/drawing/2010/main" val="0"/>
@@ -1904,8 +1899,8 @@
     <w:p>
       <w:pPr>
         <w:sectPr>
-          <w:headerReference w:type="even" r:id="rId23"/>
-          <w:headerReference w:type="default" r:id="rId24"/>
+          <w:headerReference w:type="even" r:id="rId22"/>
+          <w:headerReference w:type="default" r:id="rId23"/>
           <w:type w:val="continuous"/>
           <w:pgSz w:w="7920" w:h="12240"/>
           <w:pgMar w:top="720" w:right="900" w:bottom="720" w:left="720" w:header="288" w:footer="0" w:gutter="360"/>
@@ -1923,9 +1918,12 @@
     <w:p>
       <w:pPr>
         <w:pStyle w:val="Heading1"/>
-        <w:spacing w:after="4200"/>
+        <w:tabs>
+          <w:tab w:val="left" w:pos="1030"/>
+        </w:tabs>
+        <w:spacing w:after="4000"/>
         <w:sectPr>
-          <w:headerReference w:type="even" r:id="rId25"/>
+          <w:headerReference w:type="even" r:id="rId24"/>
           <w:type w:val="continuous"/>
           <w:pgSz w:w="7920" w:h="12240"/>
           <w:pgMar w:top="720" w:right="900" w:bottom="720" w:left="720" w:header="288" w:footer="0" w:gutter="360"/>
@@ -1939,6 +1937,9 @@
         <w:lastRenderedPageBreak/>
         <w:t>5</w:t>
       </w:r>
+      <w:r>
+        <w:tab/>
+      </w:r>
     </w:p>
     <w:p>
       <w:proofErr w:type="spellStart"/>
@@ -1952,7 +1953,7 @@
     </w:p>
     <w:p>
       <w:r>
-        <w:t xml:space="preserve">The room beyond the observation window was small and clinical. A metal stand beside the table. A single overhead </w:t>
+        <w:t xml:space="preserve">The room beyond the observation window was small and clinical. A single overhead </w:t>
       </w:r>
       <w:proofErr w:type="gramStart"/>
       <w:r>
@@ -1960,7 +1961,7 @@
       </w:r>
       <w:proofErr w:type="gramEnd"/>
       <w:r>
-        <w:t>. Tom stood on the other side of the glass, hands in his pockets, watching. He thought about a cornered thing finding a crack. A last lit room at the end of a long dark corridor, doing the only thing it could with the time it had left.</w:t>
+        <w:t>. A man in a white coat stood near the wall, hands folded, glancing at the clock. Tom stood on the other side of the glass, hands in his pockets, watching. He thought about a cornered thing finding a crack. A last lit room at the end of a long dark corridor, doing the only thing it could with the time it had left.</w:t>
       </w:r>
     </w:p>
     <w:p>
@@ -1979,7 +1980,7 @@
         </w:rPr>
         <w:lastRenderedPageBreak/>
         <w:drawing>
-          <wp:inline distT="0" distB="0" distL="0" distR="0" wp14:anchorId="70DCEA81" wp14:editId="640AC77A">
+          <wp:inline distT="0" distB="0" distL="0" distR="0" wp14:anchorId="4BB21A32" wp14:editId="0AA3C177">
             <wp:extent cx="3995420" cy="6867525"/>
             <wp:effectExtent l="0" t="0" r="5080" b="9525"/>
             <wp:docPr id="1" name="Picture 1" descr="Stripes under the blanket"/>
@@ -1996,7 +1997,7 @@
                     </pic:cNvPicPr>
                   </pic:nvPicPr>
                   <pic:blipFill rotWithShape="1">
-                    <a:blip r:embed="rId26" cstate="print">
+                    <a:blip r:embed="rId25" cstate="print">
                       <a:extLst>
                         <a:ext uri="{28A0092B-C50C-407E-A947-70E740481C1C}">
                           <a14:useLocalDpi xmlns:a14="http://schemas.microsoft.com/office/drawing/2010/main" val="0"/>
@@ -2220,7 +2221,7 @@
     <w:p>
       <w:pPr>
         <w:sectPr>
-          <w:headerReference w:type="even" r:id="rId27"/>
+          <w:headerReference w:type="even" r:id="rId26"/>
           <w:type w:val="continuous"/>
           <w:pgSz w:w="7920" w:h="12240"/>
           <w:pgMar w:top="720" w:right="900" w:bottom="720" w:left="720" w:header="288" w:footer="0" w:gutter="360"/>
@@ -2307,7 +2308,7 @@
       <w:pPr>
         <w:ind w:left="317" w:firstLine="0"/>
         <w:sectPr>
-          <w:headerReference w:type="default" r:id="rId28"/>
+          <w:headerReference w:type="default" r:id="rId27"/>
           <w:type w:val="oddPage"/>
           <w:pgSz w:w="7920" w:h="12240"/>
           <w:pgMar w:top="720" w:right="900" w:bottom="720" w:left="720" w:header="288" w:footer="0" w:gutter="360"/>
@@ -2329,73 +2330,41 @@
     <w:p>
       <w:pPr>
         <w:pStyle w:val="PermissionsBody"/>
-        <w:rPr>
-          <w:sz w:val="28"/>
-          <w:szCs w:val="28"/>
-        </w:rPr>
-      </w:pPr>
-      <w:r>
-        <w:rPr>
-          <w:sz w:val="28"/>
-          <w:szCs w:val="28"/>
-        </w:rPr>
+      </w:pPr>
+      <w:r>
         <w:t>Grateful acknowledgment is made for the lyrics reprinted herein without the knowledge or consent of Universal Music Publishing Group, to whom no apology has been or will be extended.</w:t>
       </w:r>
     </w:p>
     <w:p>
       <w:pPr>
         <w:pStyle w:val="PermissionsBody"/>
-        <w:rPr>
-          <w:sz w:val="28"/>
-          <w:szCs w:val="28"/>
-        </w:rPr>
-      </w:pPr>
-      <w:r>
-        <w:rPr>
-          <w:sz w:val="28"/>
-          <w:szCs w:val="28"/>
-        </w:rPr>
+      </w:pPr>
+      <w:r>
         <w:t>All lyrics from </w:t>
       </w:r>
       <w:r>
         <w:rPr>
           <w:rStyle w:val="Emphasis"/>
-          <w:sz w:val="28"/>
-          <w:szCs w:val="28"/>
+          <w:sz w:val="24"/>
+          <w:szCs w:val="24"/>
         </w:rPr>
         <w:t>Pop</w:t>
       </w:r>
       <w:r>
-        <w:rPr>
-          <w:sz w:val="28"/>
-          <w:szCs w:val="28"/>
-        </w:rPr>
         <w:t> by U2 (Island Records, 1997). All lyrics by Bono and The Edge. All music by U2.</w:t>
       </w:r>
     </w:p>
     <w:p>
       <w:pPr>
         <w:pStyle w:val="PermissionsBody"/>
-        <w:rPr>
-          <w:sz w:val="28"/>
-          <w:szCs w:val="28"/>
-        </w:rPr>
-      </w:pPr>
-      <w:r>
-        <w:rPr>
-          <w:sz w:val="28"/>
-          <w:szCs w:val="28"/>
-        </w:rPr>
+      </w:pPr>
+      <w:r>
         <w:t>The album's influence on the characters in this story is documented below, in order of appearance.</w:t>
       </w:r>
     </w:p>
     <w:p>
       <w:pPr>
         <w:pStyle w:val="PermissionsBody"/>
-        <w:rPr>
-          <w:sz w:val="28"/>
-          <w:szCs w:val="28"/>
-        </w:rPr>
       </w:pPr>
     </w:p>
     <w:p>
@@ -2518,7 +2487,6 @@
         <w:rPr>
           <w:rStyle w:val="PermissionsLyricChar"/>
         </w:rPr>
-        <w:lastRenderedPageBreak/>
         <w:t>"I'm already gone. Felt that way all along."</w:t>
       </w:r>
       <w:r>
@@ -2557,6 +2525,7 @@
       <w:pPr>
         <w:ind w:left="317" w:firstLine="0"/>
         <w:sectPr>
+          <w:headerReference w:type="even" r:id="rId28"/>
           <w:type w:val="oddPage"/>
           <w:pgSz w:w="7920" w:h="12240"/>
           <w:pgMar w:top="720" w:right="900" w:bottom="720" w:left="720" w:header="288" w:footer="0" w:gutter="360"/>
@@ -2628,7 +2597,52 @@
         <w:pStyle w:val="Colophon"/>
       </w:pPr>
       <w:r>
-        <w:t>This book was written in Microsoft Word, laid out in Adobe InDesign, retouched in Adobe Photoshop, and — in its final form — edited as plain text Markdown files in Visual Studio Code, a professional software engineering environment designed for building complex applications, which was used here exclusively to add and remove italics. The manuscript was then passed through a custom-built four-stage AI editing pipeline comprising a developmental editor, a line editor, a copy editor, and a proofreader — each a separate artificial intelligence agent with its own reference library and style guide. This is the kind of infrastructure typically reserved for publishing houses with hundreds of employees. It was used here on a twenty-eight-page story about a stuffed zebra. None of the four agents asked why the zebra was on the boy's head.</w:t>
+        <w:t xml:space="preserve">This book was written in plain text </w:t>
+      </w:r>
+      <w:r>
+        <w:t>Markdown files in Visual Studio Code, a professional software engineering environment designed for building complex applications, which was used here exclusively to add and remove italics.</w:t>
+      </w:r>
+      <w:r>
+        <w:t xml:space="preserve"> It was then</w:t>
+      </w:r>
+      <w:r>
+        <w:t xml:space="preserve"> laid out in Adobe InDesign, </w:t>
+      </w:r>
+      <w:r>
+        <w:t>the cover composed</w:t>
+      </w:r>
+      <w:r>
+        <w:t xml:space="preserve"> in Adobe Photoshop, and — in its final form —</w:t>
+      </w:r>
+      <w:r>
+        <w:t xml:space="preserve"> </w:t>
+      </w:r>
+      <w:r>
+        <w:t xml:space="preserve">passed through a custom-built four-stage AI editing pipeline comprising </w:t>
+      </w:r>
+      <w:r>
+        <w:t xml:space="preserve">of </w:t>
+      </w:r>
+      <w:r>
+        <w:t>developmenta</w:t>
+      </w:r>
+      <w:r>
+        <w:t>l</w:t>
+      </w:r>
+      <w:r>
+        <w:t xml:space="preserve">, line, </w:t>
+      </w:r>
+      <w:r>
+        <w:t xml:space="preserve">and </w:t>
+      </w:r>
+      <w:r>
+        <w:t>copy</w:t>
+      </w:r>
+      <w:r>
+        <w:t xml:space="preserve"> editors</w:t>
+      </w:r>
+      <w:r>
+        <w:t>, and a proofreader — each a separate artificial intelligence agent with its own reference library and style guide. This is the kind of infrastructure typically reserved for publishing houses with hundreds of employees. It was used here on a twenty-eight-page story about a stuffed zebra. None of the four agents asked why the zebra was on the boy's head.</w:t>
       </w:r>
     </w:p>
     <w:p>
@@ -2644,7 +2658,13 @@
         <w:pStyle w:val="Colophon"/>
       </w:pPr>
       <w:r>
-        <w:t>The photographs were taken in 1997 on a disposable camera by Rebecca Stewart, who was leaving for college and had no idea she was creating evidence. They were developed at a drugstore. The total production budget for the visual component of this book was approximately $6.99.</w:t>
+        <w:t xml:space="preserve">The photographs were taken in 1997 on a disposable camera by Rebecca Stewart, who </w:t>
+      </w:r>
+      <w:r>
+        <w:t>was</w:t>
+      </w:r>
+      <w:r>
+        <w:t xml:space="preserve"> leaving for college and had no idea she was creating evidence. They were developed at a drugstore. The total production budget for the visual component of this book was approximately $6.99.</w:t>
       </w:r>
     </w:p>
     <w:p>
@@ -2676,7 +2696,6 @@
         <w:pStyle w:val="Colophon"/>
       </w:pPr>
       <w:r>
-        <w:lastRenderedPageBreak/>
         <w:t>The cover was designed in Photoshop by the author, who is not a graphic designer and would like that noted for the record.</w:t>
       </w:r>
     </w:p>
@@ -2689,6 +2708,7 @@
       </w:r>
     </w:p>
     <w:sectPr>
+      <w:headerReference w:type="even" r:id="rId29"/>
       <w:pgSz w:w="7920" w:h="12240"/>
       <w:pgMar w:top="720" w:right="900" w:bottom="720" w:left="720" w:header="288" w:footer="0" w:gutter="360"/>
       <w:pgNumType w:start="1"/>
@@ -2754,59 +2774,13 @@
   <w:p>
     <w:pPr>
       <w:pStyle w:val="Header"/>
+      <w:jc w:val="right"/>
     </w:pPr>
   </w:p>
 </w:hdr>
 </file>
 
 <file path=word/header10.xml><?xml version="1.0" encoding="utf-8"?>
-<w:hdr xmlns:wpc="http://schemas.microsoft.com/office/word/2010/wordprocessingCanvas" xmlns:cx="http://schemas.microsoft.com/office/drawing/2014/chartex" xmlns:cx1="http://schemas.microsoft.com/office/drawing/2015/9/8/chartex" xmlns:cx2="http://schemas.microsoft.com/office/drawing/2015/10/21/chartex" xmlns:cx3="http://schemas.microsoft.com/office/drawing/2016/5/9/chartex" xmlns:cx4="http://schemas.microsoft.com/office/drawing/2016/5/10/chartex" xmlns:cx5="http://schemas.microsoft.com/office/drawing/2016/5/11/chartex" xmlns:cx6="http://schemas.microsoft.com/office/drawing/2016/5/12/chartex" xmlns:cx7="http://schemas.microsoft.com/office/drawing/2016/5/13/chartex" xmlns:cx8="http://schemas.microsoft.com/office/drawing/2016/5/14/chartex" xmlns:mc="http://schemas.openxmlformats.org/markup-compatibility/2006" xmlns:aink="http://schemas.microsoft.com/office/drawing/2016/ink" xmlns:am3d="http://schemas.microsoft.com/office/drawing/2017/model3d" xmlns:o="urn:schemas-microsoft-com:office:office" xmlns:oel="http://schemas.microsoft.com/office/2019/extlst" xmlns:r="http://schemas.openxmlformats.org/officeDocument/2006/relationships" xmlns:m="http://schemas.openxmlformats.org/officeDocument/2006/math" xmlns:v="urn:schemas-microsoft-com:vml" xmlns:wp14="http://schemas.microsoft.com/office/word/2010/wordprocessingDrawing" xmlns:wp="http://schemas.openxmlformats.org/drawingml/2006/wordprocessingDrawing" xmlns:w10="urn:schemas-microsoft-com:office:word" xmlns:w="http://schemas.openxmlformats.org/wordprocessingml/2006/main" xmlns:w14="http://schemas.microsoft.com/office/word/2010/wordml" xmlns:w15="http://schemas.microsoft.com/office/word/2012/wordml" xmlns:w16cex="http://schemas.microsoft.com/office/word/2018/wordml/cex" xmlns:w16cid="http://schemas.microsoft.com/office/word/2016/wordml/cid" xmlns:w16="http://schemas.microsoft.com/office/word/2018/wordml" xmlns:w16du="http://schemas.microsoft.com/office/word/2023/wordml/word16du" xmlns:w16sdtdh="http://schemas.microsoft.com/office/word/2020/wordml/sdtdatahash" xmlns:w16se="http://schemas.microsoft.com/office/word/2015/wordml/symex" xmlns:wpg="http://schemas.microsoft.com/office/word/2010/wordprocessingGroup" xmlns:wpi="http://schemas.microsoft.com/office/word/2010/wordprocessingInk" xmlns:wne="http://schemas.microsoft.com/office/word/2006/wordml" xmlns:wps="http://schemas.microsoft.com/office/word/2010/wordprocessingShape" mc:Ignorable="w14 w15 w16se w16cid w16 w16cex w16sdtdh wp14">
-  <w:sdt>
-    <w:sdtPr>
-      <w:id w:val="1498765187"/>
-      <w:docPartObj>
-        <w:docPartGallery w:val="Page Numbers (Top of Page)"/>
-        <w:docPartUnique/>
-      </w:docPartObj>
-    </w:sdtPr>
-    <w:sdtEndPr>
-      <w:rPr>
-        <w:noProof/>
-      </w:rPr>
-    </w:sdtEndPr>
-    <w:sdtContent>
-      <w:p>
-        <w:pPr>
-          <w:pStyle w:val="Header"/>
-        </w:pPr>
-        <w:r>
-          <w:fldChar w:fldCharType="begin"/>
-        </w:r>
-        <w:r>
-          <w:instrText xml:space="preserve"> PAGE   \* MERGEFORMAT </w:instrText>
-        </w:r>
-        <w:r>
-          <w:fldChar w:fldCharType="separate"/>
-        </w:r>
-        <w:r>
-          <w:rPr>
-            <w:noProof/>
-          </w:rPr>
-          <w:t>2</w:t>
-        </w:r>
-        <w:r>
-          <w:rPr>
-            <w:noProof/>
-          </w:rPr>
-          <w:fldChar w:fldCharType="end"/>
-        </w:r>
-      </w:p>
-    </w:sdtContent>
-  </w:sdt>
-</w:hdr>
-</file>
-
-<file path=word/header11.xml><?xml version="1.0" encoding="utf-8"?>
 <w:hdr xmlns:wpc="http://schemas.microsoft.com/office/word/2010/wordprocessingCanvas" xmlns:cx="http://schemas.microsoft.com/office/drawing/2014/chartex" xmlns:cx1="http://schemas.microsoft.com/office/drawing/2015/9/8/chartex" xmlns:cx2="http://schemas.microsoft.com/office/drawing/2015/10/21/chartex" xmlns:cx3="http://schemas.microsoft.com/office/drawing/2016/5/9/chartex" xmlns:cx4="http://schemas.microsoft.com/office/drawing/2016/5/10/chartex" xmlns:cx5="http://schemas.microsoft.com/office/drawing/2016/5/11/chartex" xmlns:cx6="http://schemas.microsoft.com/office/drawing/2016/5/12/chartex" xmlns:cx7="http://schemas.microsoft.com/office/drawing/2016/5/13/chartex" xmlns:cx8="http://schemas.microsoft.com/office/drawing/2016/5/14/chartex" xmlns:mc="http://schemas.openxmlformats.org/markup-compatibility/2006" xmlns:aink="http://schemas.microsoft.com/office/drawing/2016/ink" xmlns:am3d="http://schemas.microsoft.com/office/drawing/2017/model3d" xmlns:o="urn:schemas-microsoft-com:office:office" xmlns:oel="http://schemas.microsoft.com/office/2019/extlst" xmlns:r="http://schemas.openxmlformats.org/officeDocument/2006/relationships" xmlns:m="http://schemas.openxmlformats.org/officeDocument/2006/math" xmlns:v="urn:schemas-microsoft-com:vml" xmlns:wp14="http://schemas.microsoft.com/office/word/2010/wordprocessingDrawing" xmlns:wp="http://schemas.openxmlformats.org/drawingml/2006/wordprocessingDrawing" xmlns:w10="urn:schemas-microsoft-com:office:word" xmlns:w="http://schemas.openxmlformats.org/wordprocessingml/2006/main" xmlns:w14="http://schemas.microsoft.com/office/word/2010/wordml" xmlns:w15="http://schemas.microsoft.com/office/word/2012/wordml" xmlns:w16cex="http://schemas.microsoft.com/office/word/2018/wordml/cex" xmlns:w16cid="http://schemas.microsoft.com/office/word/2016/wordml/cid" xmlns:w16="http://schemas.microsoft.com/office/word/2018/wordml" xmlns:w16du="http://schemas.microsoft.com/office/word/2023/wordml/word16du" xmlns:w16sdtdh="http://schemas.microsoft.com/office/word/2020/wordml/sdtdatahash" xmlns:w16se="http://schemas.microsoft.com/office/word/2015/wordml/symex" xmlns:wpg="http://schemas.microsoft.com/office/word/2010/wordprocessingGroup" xmlns:wpi="http://schemas.microsoft.com/office/word/2010/wordprocessingInk" xmlns:wne="http://schemas.microsoft.com/office/word/2006/wordml" xmlns:wps="http://schemas.microsoft.com/office/word/2010/wordprocessingShape" mc:Ignorable="w14 w15 w16se w16cid w16 w16cex w16sdtdh wp14">
   <w:sdt>
     <w:sdtPr>
@@ -2854,7 +2828,7 @@
 </w:hdr>
 </file>
 
-<file path=word/header12.xml><?xml version="1.0" encoding="utf-8"?>
+<file path=word/header11.xml><?xml version="1.0" encoding="utf-8"?>
 <w:hdr xmlns:wpc="http://schemas.microsoft.com/office/word/2010/wordprocessingCanvas" xmlns:cx="http://schemas.microsoft.com/office/drawing/2014/chartex" xmlns:cx1="http://schemas.microsoft.com/office/drawing/2015/9/8/chartex" xmlns:cx2="http://schemas.microsoft.com/office/drawing/2015/10/21/chartex" xmlns:cx3="http://schemas.microsoft.com/office/drawing/2016/5/9/chartex" xmlns:cx4="http://schemas.microsoft.com/office/drawing/2016/5/10/chartex" xmlns:cx5="http://schemas.microsoft.com/office/drawing/2016/5/11/chartex" xmlns:cx6="http://schemas.microsoft.com/office/drawing/2016/5/12/chartex" xmlns:cx7="http://schemas.microsoft.com/office/drawing/2016/5/13/chartex" xmlns:cx8="http://schemas.microsoft.com/office/drawing/2016/5/14/chartex" xmlns:mc="http://schemas.openxmlformats.org/markup-compatibility/2006" xmlns:aink="http://schemas.microsoft.com/office/drawing/2016/ink" xmlns:am3d="http://schemas.microsoft.com/office/drawing/2017/model3d" xmlns:o="urn:schemas-microsoft-com:office:office" xmlns:oel="http://schemas.microsoft.com/office/2019/extlst" xmlns:r="http://schemas.openxmlformats.org/officeDocument/2006/relationships" xmlns:m="http://schemas.openxmlformats.org/officeDocument/2006/math" xmlns:v="urn:schemas-microsoft-com:vml" xmlns:wp14="http://schemas.microsoft.com/office/word/2010/wordprocessingDrawing" xmlns:wp="http://schemas.openxmlformats.org/drawingml/2006/wordprocessingDrawing" xmlns:w10="urn:schemas-microsoft-com:office:word" xmlns:w="http://schemas.openxmlformats.org/wordprocessingml/2006/main" xmlns:w14="http://schemas.microsoft.com/office/word/2010/wordml" xmlns:w15="http://schemas.microsoft.com/office/word/2012/wordml" xmlns:w16cex="http://schemas.microsoft.com/office/word/2018/wordml/cex" xmlns:w16cid="http://schemas.microsoft.com/office/word/2016/wordml/cid" xmlns:w16="http://schemas.microsoft.com/office/word/2018/wordml" xmlns:w16du="http://schemas.microsoft.com/office/word/2023/wordml/word16du" xmlns:w16sdtdh="http://schemas.microsoft.com/office/word/2020/wordml/sdtdatahash" xmlns:w16se="http://schemas.microsoft.com/office/word/2015/wordml/symex" xmlns:wpg="http://schemas.microsoft.com/office/word/2010/wordprocessingGroup" xmlns:wpi="http://schemas.microsoft.com/office/word/2010/wordprocessingInk" xmlns:wne="http://schemas.microsoft.com/office/word/2006/wordml" xmlns:wps="http://schemas.microsoft.com/office/word/2010/wordprocessingShape" mc:Ignorable="w14 w15 w16se w16cid w16 w16cex w16sdtdh wp14">
   <w:p>
     <w:pPr>
@@ -2864,11 +2838,59 @@
 </w:hdr>
 </file>
 
+<file path=word/header12.xml><?xml version="1.0" encoding="utf-8"?>
+<w:hdr xmlns:wpc="http://schemas.microsoft.com/office/word/2010/wordprocessingCanvas" xmlns:cx="http://schemas.microsoft.com/office/drawing/2014/chartex" xmlns:cx1="http://schemas.microsoft.com/office/drawing/2015/9/8/chartex" xmlns:cx2="http://schemas.microsoft.com/office/drawing/2015/10/21/chartex" xmlns:cx3="http://schemas.microsoft.com/office/drawing/2016/5/9/chartex" xmlns:cx4="http://schemas.microsoft.com/office/drawing/2016/5/10/chartex" xmlns:cx5="http://schemas.microsoft.com/office/drawing/2016/5/11/chartex" xmlns:cx6="http://schemas.microsoft.com/office/drawing/2016/5/12/chartex" xmlns:cx7="http://schemas.microsoft.com/office/drawing/2016/5/13/chartex" xmlns:cx8="http://schemas.microsoft.com/office/drawing/2016/5/14/chartex" xmlns:mc="http://schemas.openxmlformats.org/markup-compatibility/2006" xmlns:aink="http://schemas.microsoft.com/office/drawing/2016/ink" xmlns:am3d="http://schemas.microsoft.com/office/drawing/2017/model3d" xmlns:o="urn:schemas-microsoft-com:office:office" xmlns:oel="http://schemas.microsoft.com/office/2019/extlst" xmlns:r="http://schemas.openxmlformats.org/officeDocument/2006/relationships" xmlns:m="http://schemas.openxmlformats.org/officeDocument/2006/math" xmlns:v="urn:schemas-microsoft-com:vml" xmlns:wp14="http://schemas.microsoft.com/office/word/2010/wordprocessingDrawing" xmlns:wp="http://schemas.openxmlformats.org/drawingml/2006/wordprocessingDrawing" xmlns:w10="urn:schemas-microsoft-com:office:word" xmlns:w="http://schemas.openxmlformats.org/wordprocessingml/2006/main" xmlns:w14="http://schemas.microsoft.com/office/word/2010/wordml" xmlns:w15="http://schemas.microsoft.com/office/word/2012/wordml" xmlns:w16cex="http://schemas.microsoft.com/office/word/2018/wordml/cex" xmlns:w16cid="http://schemas.microsoft.com/office/word/2016/wordml/cid" xmlns:w16="http://schemas.microsoft.com/office/word/2018/wordml" xmlns:w16du="http://schemas.microsoft.com/office/word/2023/wordml/word16du" xmlns:w16sdtdh="http://schemas.microsoft.com/office/word/2020/wordml/sdtdatahash" xmlns:w16se="http://schemas.microsoft.com/office/word/2015/wordml/symex" xmlns:wpg="http://schemas.microsoft.com/office/word/2010/wordprocessingGroup" xmlns:wpi="http://schemas.microsoft.com/office/word/2010/wordprocessingInk" xmlns:wne="http://schemas.microsoft.com/office/word/2006/wordml" xmlns:wps="http://schemas.microsoft.com/office/word/2010/wordprocessingShape" mc:Ignorable="w14 w15 w16se w16cid w16 w16cex w16sdtdh wp14">
+  <w:sdt>
+    <w:sdtPr>
+      <w:id w:val="-1463340437"/>
+      <w:docPartObj>
+        <w:docPartGallery w:val="Page Numbers (Top of Page)"/>
+        <w:docPartUnique/>
+      </w:docPartObj>
+    </w:sdtPr>
+    <w:sdtEndPr>
+      <w:rPr>
+        <w:noProof/>
+      </w:rPr>
+    </w:sdtEndPr>
+    <w:sdtContent>
+      <w:p>
+        <w:pPr>
+          <w:pStyle w:val="Header"/>
+        </w:pPr>
+        <w:r>
+          <w:fldChar w:fldCharType="begin"/>
+        </w:r>
+        <w:r>
+          <w:instrText xml:space="preserve"> PAGE   \* MERGEFORMAT </w:instrText>
+        </w:r>
+        <w:r>
+          <w:fldChar w:fldCharType="separate"/>
+        </w:r>
+        <w:r>
+          <w:rPr>
+            <w:noProof/>
+          </w:rPr>
+          <w:t>2</w:t>
+        </w:r>
+        <w:r>
+          <w:rPr>
+            <w:noProof/>
+          </w:rPr>
+          <w:fldChar w:fldCharType="end"/>
+        </w:r>
+      </w:p>
+    </w:sdtContent>
+  </w:sdt>
+</w:hdr>
+</file>
+
 <file path=word/header13.xml><?xml version="1.0" encoding="utf-8"?>
 <w:hdr xmlns:wpc="http://schemas.microsoft.com/office/word/2010/wordprocessingCanvas" xmlns:cx="http://schemas.microsoft.com/office/drawing/2014/chartex" xmlns:cx1="http://schemas.microsoft.com/office/drawing/2015/9/8/chartex" xmlns:cx2="http://schemas.microsoft.com/office/drawing/2015/10/21/chartex" xmlns:cx3="http://schemas.microsoft.com/office/drawing/2016/5/9/chartex" xmlns:cx4="http://schemas.microsoft.com/office/drawing/2016/5/10/chartex" xmlns:cx5="http://schemas.microsoft.com/office/drawing/2016/5/11/chartex" xmlns:cx6="http://schemas.microsoft.com/office/drawing/2016/5/12/chartex" xmlns:cx7="http://schemas.microsoft.com/office/drawing/2016/5/13/chartex" xmlns:cx8="http://schemas.microsoft.com/office/drawing/2016/5/14/chartex" xmlns:mc="http://schemas.openxmlformats.org/markup-compatibility/2006" xmlns:aink="http://schemas.microsoft.com/office/drawing/2016/ink" xmlns:am3d="http://schemas.microsoft.com/office/drawing/2017/model3d" xmlns:o="urn:schemas-microsoft-com:office:office" xmlns:oel="http://schemas.microsoft.com/office/2019/extlst" xmlns:r="http://schemas.openxmlformats.org/officeDocument/2006/relationships" xmlns:m="http://schemas.openxmlformats.org/officeDocument/2006/math" xmlns:v="urn:schemas-microsoft-com:vml" xmlns:wp14="http://schemas.microsoft.com/office/word/2010/wordprocessingDrawing" xmlns:wp="http://schemas.openxmlformats.org/drawingml/2006/wordprocessingDrawing" xmlns:w10="urn:schemas-microsoft-com:office:word" xmlns:w="http://schemas.openxmlformats.org/wordprocessingml/2006/main" xmlns:w14="http://schemas.microsoft.com/office/word/2010/wordml" xmlns:w15="http://schemas.microsoft.com/office/word/2012/wordml" xmlns:w16cex="http://schemas.microsoft.com/office/word/2018/wordml/cex" xmlns:w16cid="http://schemas.microsoft.com/office/word/2016/wordml/cid" xmlns:w16="http://schemas.microsoft.com/office/word/2018/wordml" xmlns:w16du="http://schemas.microsoft.com/office/word/2023/wordml/word16du" xmlns:w16sdtdh="http://schemas.microsoft.com/office/word/2020/wordml/sdtdatahash" xmlns:w16se="http://schemas.microsoft.com/office/word/2015/wordml/symex" xmlns:wpg="http://schemas.microsoft.com/office/word/2010/wordprocessingGroup" xmlns:wpi="http://schemas.microsoft.com/office/word/2010/wordprocessingInk" xmlns:wne="http://schemas.microsoft.com/office/word/2006/wordml" xmlns:wps="http://schemas.microsoft.com/office/word/2010/wordprocessingShape" mc:Ignorable="w14 w15 w16se w16cid w16 w16cex w16sdtdh wp14">
   <w:p>
     <w:pPr>
       <w:pStyle w:val="Header"/>
+      <w:jc w:val="right"/>
     </w:pPr>
   </w:p>
 </w:hdr>
@@ -2879,24 +2901,38 @@
   <w:p>
     <w:pPr>
       <w:pStyle w:val="Header"/>
-      <w:jc w:val="right"/>
     </w:pPr>
   </w:p>
 </w:hdr>
 </file>
 
-<file path=word/header2.xml><?xml version="1.0" encoding="utf-8"?>
+<file path=word/header15.xml><?xml version="1.0" encoding="utf-8"?>
 <w:hdr xmlns:wpc="http://schemas.microsoft.com/office/word/2010/wordprocessingCanvas" xmlns:cx="http://schemas.microsoft.com/office/drawing/2014/chartex" xmlns:cx1="http://schemas.microsoft.com/office/drawing/2015/9/8/chartex" xmlns:cx2="http://schemas.microsoft.com/office/drawing/2015/10/21/chartex" xmlns:cx3="http://schemas.microsoft.com/office/drawing/2016/5/9/chartex" xmlns:cx4="http://schemas.microsoft.com/office/drawing/2016/5/10/chartex" xmlns:cx5="http://schemas.microsoft.com/office/drawing/2016/5/11/chartex" xmlns:cx6="http://schemas.microsoft.com/office/drawing/2016/5/12/chartex" xmlns:cx7="http://schemas.microsoft.com/office/drawing/2016/5/13/chartex" xmlns:cx8="http://schemas.microsoft.com/office/drawing/2016/5/14/chartex" xmlns:mc="http://schemas.openxmlformats.org/markup-compatibility/2006" xmlns:aink="http://schemas.microsoft.com/office/drawing/2016/ink" xmlns:am3d="http://schemas.microsoft.com/office/drawing/2017/model3d" xmlns:o="urn:schemas-microsoft-com:office:office" xmlns:oel="http://schemas.microsoft.com/office/2019/extlst" xmlns:r="http://schemas.openxmlformats.org/officeDocument/2006/relationships" xmlns:m="http://schemas.openxmlformats.org/officeDocument/2006/math" xmlns:v="urn:schemas-microsoft-com:vml" xmlns:wp14="http://schemas.microsoft.com/office/word/2010/wordprocessingDrawing" xmlns:wp="http://schemas.openxmlformats.org/drawingml/2006/wordprocessingDrawing" xmlns:w10="urn:schemas-microsoft-com:office:word" xmlns:w="http://schemas.openxmlformats.org/wordprocessingml/2006/main" xmlns:w14="http://schemas.microsoft.com/office/word/2010/wordml" xmlns:w15="http://schemas.microsoft.com/office/word/2012/wordml" xmlns:w16cex="http://schemas.microsoft.com/office/word/2018/wordml/cex" xmlns:w16cid="http://schemas.microsoft.com/office/word/2016/wordml/cid" xmlns:w16="http://schemas.microsoft.com/office/word/2018/wordml" xmlns:w16du="http://schemas.microsoft.com/office/word/2023/wordml/word16du" xmlns:w16sdtdh="http://schemas.microsoft.com/office/word/2020/wordml/sdtdatahash" xmlns:w16se="http://schemas.microsoft.com/office/word/2015/wordml/symex" xmlns:wpg="http://schemas.microsoft.com/office/word/2010/wordprocessingGroup" xmlns:wpi="http://schemas.microsoft.com/office/word/2010/wordprocessingInk" xmlns:wne="http://schemas.microsoft.com/office/word/2006/wordml" xmlns:wps="http://schemas.microsoft.com/office/word/2010/wordprocessingShape" mc:Ignorable="w14 w15 w16se w16cid w16 w16cex w16sdtdh wp14">
-  <w:p>
-    <w:pPr>
-      <w:pStyle w:val="Header"/>
-      <w:jc w:val="right"/>
-    </w:pPr>
-  </w:p>
+  <w:sdt>
+    <w:sdtPr>
+      <w:id w:val="237992615"/>
+      <w:docPartObj>
+        <w:docPartGallery w:val="Page Numbers (Top of Page)"/>
+        <w:docPartUnique/>
+      </w:docPartObj>
+    </w:sdtPr>
+    <w:sdtEndPr>
+      <w:rPr>
+        <w:noProof/>
+      </w:rPr>
+    </w:sdtEndPr>
+    <w:sdtContent>
+      <w:p>
+        <w:pPr>
+          <w:pStyle w:val="Header"/>
+        </w:pPr>
+      </w:p>
+    </w:sdtContent>
+  </w:sdt>
 </w:hdr>
 </file>
 
-<file path=word/header3.xml><?xml version="1.0" encoding="utf-8"?>
+<file path=word/header2.xml><?xml version="1.0" encoding="utf-8"?>
 <w:hdr xmlns:wpc="http://schemas.microsoft.com/office/word/2010/wordprocessingCanvas" xmlns:cx="http://schemas.microsoft.com/office/drawing/2014/chartex" xmlns:cx1="http://schemas.microsoft.com/office/drawing/2015/9/8/chartex" xmlns:cx2="http://schemas.microsoft.com/office/drawing/2015/10/21/chartex" xmlns:cx3="http://schemas.microsoft.com/office/drawing/2016/5/9/chartex" xmlns:cx4="http://schemas.microsoft.com/office/drawing/2016/5/10/chartex" xmlns:cx5="http://schemas.microsoft.com/office/drawing/2016/5/11/chartex" xmlns:cx6="http://schemas.microsoft.com/office/drawing/2016/5/12/chartex" xmlns:cx7="http://schemas.microsoft.com/office/drawing/2016/5/13/chartex" xmlns:cx8="http://schemas.microsoft.com/office/drawing/2016/5/14/chartex" xmlns:mc="http://schemas.openxmlformats.org/markup-compatibility/2006" xmlns:aink="http://schemas.microsoft.com/office/drawing/2016/ink" xmlns:am3d="http://schemas.microsoft.com/office/drawing/2017/model3d" xmlns:o="urn:schemas-microsoft-com:office:office" xmlns:oel="http://schemas.microsoft.com/office/2019/extlst" xmlns:r="http://schemas.openxmlformats.org/officeDocument/2006/relationships" xmlns:m="http://schemas.openxmlformats.org/officeDocument/2006/math" xmlns:v="urn:schemas-microsoft-com:vml" xmlns:wp14="http://schemas.microsoft.com/office/word/2010/wordprocessingDrawing" xmlns:wp="http://schemas.openxmlformats.org/drawingml/2006/wordprocessingDrawing" xmlns:w10="urn:schemas-microsoft-com:office:word" xmlns:w="http://schemas.openxmlformats.org/wordprocessingml/2006/main" xmlns:w14="http://schemas.microsoft.com/office/word/2010/wordml" xmlns:w15="http://schemas.microsoft.com/office/word/2012/wordml" xmlns:w16cex="http://schemas.microsoft.com/office/word/2018/wordml/cex" xmlns:w16cid="http://schemas.microsoft.com/office/word/2016/wordml/cid" xmlns:w16="http://schemas.microsoft.com/office/word/2018/wordml" xmlns:w16du="http://schemas.microsoft.com/office/word/2023/wordml/word16du" xmlns:w16sdtdh="http://schemas.microsoft.com/office/word/2020/wordml/sdtdatahash" xmlns:w16se="http://schemas.microsoft.com/office/word/2015/wordml/symex" xmlns:wpg="http://schemas.microsoft.com/office/word/2010/wordprocessingGroup" xmlns:wpi="http://schemas.microsoft.com/office/word/2010/wordprocessingInk" xmlns:wne="http://schemas.microsoft.com/office/word/2006/wordml" xmlns:wps="http://schemas.microsoft.com/office/word/2010/wordprocessingShape" mc:Ignorable="w14 w15 w16se w16cid w16 w16cex w16sdtdh wp14">
   <w:sdt>
     <w:sdtPr>
@@ -2944,7 +2980,7 @@
 </w:hdr>
 </file>
 
-<file path=word/header4.xml><?xml version="1.0" encoding="utf-8"?>
+<file path=word/header3.xml><?xml version="1.0" encoding="utf-8"?>
 <w:hdr xmlns:wpc="http://schemas.microsoft.com/office/word/2010/wordprocessingCanvas" xmlns:cx="http://schemas.microsoft.com/office/drawing/2014/chartex" xmlns:cx1="http://schemas.microsoft.com/office/drawing/2015/9/8/chartex" xmlns:cx2="http://schemas.microsoft.com/office/drawing/2015/10/21/chartex" xmlns:cx3="http://schemas.microsoft.com/office/drawing/2016/5/9/chartex" xmlns:cx4="http://schemas.microsoft.com/office/drawing/2016/5/10/chartex" xmlns:cx5="http://schemas.microsoft.com/office/drawing/2016/5/11/chartex" xmlns:cx6="http://schemas.microsoft.com/office/drawing/2016/5/12/chartex" xmlns:cx7="http://schemas.microsoft.com/office/drawing/2016/5/13/chartex" xmlns:cx8="http://schemas.microsoft.com/office/drawing/2016/5/14/chartex" xmlns:mc="http://schemas.openxmlformats.org/markup-compatibility/2006" xmlns:aink="http://schemas.microsoft.com/office/drawing/2016/ink" xmlns:am3d="http://schemas.microsoft.com/office/drawing/2017/model3d" xmlns:o="urn:schemas-microsoft-com:office:office" xmlns:oel="http://schemas.microsoft.com/office/2019/extlst" xmlns:r="http://schemas.openxmlformats.org/officeDocument/2006/relationships" xmlns:m="http://schemas.openxmlformats.org/officeDocument/2006/math" xmlns:v="urn:schemas-microsoft-com:vml" xmlns:wp14="http://schemas.microsoft.com/office/word/2010/wordprocessingDrawing" xmlns:wp="http://schemas.openxmlformats.org/drawingml/2006/wordprocessingDrawing" xmlns:w10="urn:schemas-microsoft-com:office:word" xmlns:w="http://schemas.openxmlformats.org/wordprocessingml/2006/main" xmlns:w14="http://schemas.microsoft.com/office/word/2010/wordml" xmlns:w15="http://schemas.microsoft.com/office/word/2012/wordml" xmlns:w16cex="http://schemas.microsoft.com/office/word/2018/wordml/cex" xmlns:w16cid="http://schemas.microsoft.com/office/word/2016/wordml/cid" xmlns:w16="http://schemas.microsoft.com/office/word/2018/wordml" xmlns:w16du="http://schemas.microsoft.com/office/word/2023/wordml/word16du" xmlns:w16sdtdh="http://schemas.microsoft.com/office/word/2020/wordml/sdtdatahash" xmlns:w16se="http://schemas.microsoft.com/office/word/2015/wordml/symex" xmlns:wpg="http://schemas.microsoft.com/office/word/2010/wordprocessingGroup" xmlns:wpi="http://schemas.microsoft.com/office/word/2010/wordprocessingInk" xmlns:wne="http://schemas.microsoft.com/office/word/2006/wordml" xmlns:wps="http://schemas.microsoft.com/office/word/2010/wordprocessingShape" mc:Ignorable="w14 w15 w16se w16cid w16 w16cex w16sdtdh wp14">
   <w:sdt>
     <w:sdtPr>
@@ -2991,7 +3027,7 @@
 </w:hdr>
 </file>
 
-<file path=word/header5.xml><?xml version="1.0" encoding="utf-8"?>
+<file path=word/header4.xml><?xml version="1.0" encoding="utf-8"?>
 <w:hdr xmlns:wpc="http://schemas.microsoft.com/office/word/2010/wordprocessingCanvas" xmlns:cx="http://schemas.microsoft.com/office/drawing/2014/chartex" xmlns:cx1="http://schemas.microsoft.com/office/drawing/2015/9/8/chartex" xmlns:cx2="http://schemas.microsoft.com/office/drawing/2015/10/21/chartex" xmlns:cx3="http://schemas.microsoft.com/office/drawing/2016/5/9/chartex" xmlns:cx4="http://schemas.microsoft.com/office/drawing/2016/5/10/chartex" xmlns:cx5="http://schemas.microsoft.com/office/drawing/2016/5/11/chartex" xmlns:cx6="http://schemas.microsoft.com/office/drawing/2016/5/12/chartex" xmlns:cx7="http://schemas.microsoft.com/office/drawing/2016/5/13/chartex" xmlns:cx8="http://schemas.microsoft.com/office/drawing/2016/5/14/chartex" xmlns:mc="http://schemas.openxmlformats.org/markup-compatibility/2006" xmlns:aink="http://schemas.microsoft.com/office/drawing/2016/ink" xmlns:am3d="http://schemas.microsoft.com/office/drawing/2017/model3d" xmlns:o="urn:schemas-microsoft-com:office:office" xmlns:oel="http://schemas.microsoft.com/office/2019/extlst" xmlns:r="http://schemas.openxmlformats.org/officeDocument/2006/relationships" xmlns:m="http://schemas.openxmlformats.org/officeDocument/2006/math" xmlns:v="urn:schemas-microsoft-com:vml" xmlns:wp14="http://schemas.microsoft.com/office/word/2010/wordprocessingDrawing" xmlns:wp="http://schemas.openxmlformats.org/drawingml/2006/wordprocessingDrawing" xmlns:w10="urn:schemas-microsoft-com:office:word" xmlns:w="http://schemas.openxmlformats.org/wordprocessingml/2006/main" xmlns:w14="http://schemas.microsoft.com/office/word/2010/wordml" xmlns:w15="http://schemas.microsoft.com/office/word/2012/wordml" xmlns:w16cex="http://schemas.microsoft.com/office/word/2018/wordml/cex" xmlns:w16cid="http://schemas.microsoft.com/office/word/2016/wordml/cid" xmlns:w16="http://schemas.microsoft.com/office/word/2018/wordml" xmlns:w16du="http://schemas.microsoft.com/office/word/2023/wordml/word16du" xmlns:w16sdtdh="http://schemas.microsoft.com/office/word/2020/wordml/sdtdatahash" xmlns:w16se="http://schemas.microsoft.com/office/word/2015/wordml/symex" xmlns:wpg="http://schemas.microsoft.com/office/word/2010/wordprocessingGroup" xmlns:wpi="http://schemas.microsoft.com/office/word/2010/wordprocessingInk" xmlns:wne="http://schemas.microsoft.com/office/word/2006/wordml" xmlns:wps="http://schemas.microsoft.com/office/word/2010/wordprocessingShape" mc:Ignorable="w14 w15 w16se w16cid w16 w16cex w16sdtdh wp14">
   <w:p>
     <w:pPr>
@@ -3001,7 +3037,7 @@
 </w:hdr>
 </file>
 
-<file path=word/header6.xml><?xml version="1.0" encoding="utf-8"?>
+<file path=word/header5.xml><?xml version="1.0" encoding="utf-8"?>
 <w:hdr xmlns:wpc="http://schemas.microsoft.com/office/word/2010/wordprocessingCanvas" xmlns:cx="http://schemas.microsoft.com/office/drawing/2014/chartex" xmlns:cx1="http://schemas.microsoft.com/office/drawing/2015/9/8/chartex" xmlns:cx2="http://schemas.microsoft.com/office/drawing/2015/10/21/chartex" xmlns:cx3="http://schemas.microsoft.com/office/drawing/2016/5/9/chartex" xmlns:cx4="http://schemas.microsoft.com/office/drawing/2016/5/10/chartex" xmlns:cx5="http://schemas.microsoft.com/office/drawing/2016/5/11/chartex" xmlns:cx6="http://schemas.microsoft.com/office/drawing/2016/5/12/chartex" xmlns:cx7="http://schemas.microsoft.com/office/drawing/2016/5/13/chartex" xmlns:cx8="http://schemas.microsoft.com/office/drawing/2016/5/14/chartex" xmlns:mc="http://schemas.openxmlformats.org/markup-compatibility/2006" xmlns:aink="http://schemas.microsoft.com/office/drawing/2016/ink" xmlns:am3d="http://schemas.microsoft.com/office/drawing/2017/model3d" xmlns:o="urn:schemas-microsoft-com:office:office" xmlns:oel="http://schemas.microsoft.com/office/2019/extlst" xmlns:r="http://schemas.openxmlformats.org/officeDocument/2006/relationships" xmlns:m="http://schemas.openxmlformats.org/officeDocument/2006/math" xmlns:v="urn:schemas-microsoft-com:vml" xmlns:wp14="http://schemas.microsoft.com/office/word/2010/wordprocessingDrawing" xmlns:wp="http://schemas.openxmlformats.org/drawingml/2006/wordprocessingDrawing" xmlns:w10="urn:schemas-microsoft-com:office:word" xmlns:w="http://schemas.openxmlformats.org/wordprocessingml/2006/main" xmlns:w14="http://schemas.microsoft.com/office/word/2010/wordml" xmlns:w15="http://schemas.microsoft.com/office/word/2012/wordml" xmlns:w16cex="http://schemas.microsoft.com/office/word/2018/wordml/cex" xmlns:w16cid="http://schemas.microsoft.com/office/word/2016/wordml/cid" xmlns:w16="http://schemas.microsoft.com/office/word/2018/wordml" xmlns:w16du="http://schemas.microsoft.com/office/word/2023/wordml/word16du" xmlns:w16sdtdh="http://schemas.microsoft.com/office/word/2020/wordml/sdtdatahash" xmlns:w16se="http://schemas.microsoft.com/office/word/2015/wordml/symex" xmlns:wpg="http://schemas.microsoft.com/office/word/2010/wordprocessingGroup" xmlns:wpi="http://schemas.microsoft.com/office/word/2010/wordprocessingInk" xmlns:wne="http://schemas.microsoft.com/office/word/2006/wordml" xmlns:wps="http://schemas.microsoft.com/office/word/2010/wordprocessingShape" mc:Ignorable="w14 w15 w16se w16cid w16 w16cex w16sdtdh wp14">
   <w:sdt>
     <w:sdtPr>
@@ -3048,7 +3084,7 @@
 </w:hdr>
 </file>
 
-<file path=word/header7.xml><?xml version="1.0" encoding="utf-8"?>
+<file path=word/header6.xml><?xml version="1.0" encoding="utf-8"?>
 <w:hdr xmlns:wpc="http://schemas.microsoft.com/office/word/2010/wordprocessingCanvas" xmlns:cx="http://schemas.microsoft.com/office/drawing/2014/chartex" xmlns:cx1="http://schemas.microsoft.com/office/drawing/2015/9/8/chartex" xmlns:cx2="http://schemas.microsoft.com/office/drawing/2015/10/21/chartex" xmlns:cx3="http://schemas.microsoft.com/office/drawing/2016/5/9/chartex" xmlns:cx4="http://schemas.microsoft.com/office/drawing/2016/5/10/chartex" xmlns:cx5="http://schemas.microsoft.com/office/drawing/2016/5/11/chartex" xmlns:cx6="http://schemas.microsoft.com/office/drawing/2016/5/12/chartex" xmlns:cx7="http://schemas.microsoft.com/office/drawing/2016/5/13/chartex" xmlns:cx8="http://schemas.microsoft.com/office/drawing/2016/5/14/chartex" xmlns:mc="http://schemas.openxmlformats.org/markup-compatibility/2006" xmlns:aink="http://schemas.microsoft.com/office/drawing/2016/ink" xmlns:am3d="http://schemas.microsoft.com/office/drawing/2017/model3d" xmlns:o="urn:schemas-microsoft-com:office:office" xmlns:oel="http://schemas.microsoft.com/office/2019/extlst" xmlns:r="http://schemas.openxmlformats.org/officeDocument/2006/relationships" xmlns:m="http://schemas.openxmlformats.org/officeDocument/2006/math" xmlns:v="urn:schemas-microsoft-com:vml" xmlns:wp14="http://schemas.microsoft.com/office/word/2010/wordprocessingDrawing" xmlns:wp="http://schemas.openxmlformats.org/drawingml/2006/wordprocessingDrawing" xmlns:w10="urn:schemas-microsoft-com:office:word" xmlns:w="http://schemas.openxmlformats.org/wordprocessingml/2006/main" xmlns:w14="http://schemas.microsoft.com/office/word/2010/wordml" xmlns:w15="http://schemas.microsoft.com/office/word/2012/wordml" xmlns:w16cex="http://schemas.microsoft.com/office/word/2018/wordml/cex" xmlns:w16cid="http://schemas.microsoft.com/office/word/2016/wordml/cid" xmlns:w16="http://schemas.microsoft.com/office/word/2018/wordml" xmlns:w16du="http://schemas.microsoft.com/office/word/2023/wordml/word16du" xmlns:w16sdtdh="http://schemas.microsoft.com/office/word/2020/wordml/sdtdatahash" xmlns:w16se="http://schemas.microsoft.com/office/word/2015/wordml/symex" xmlns:wpg="http://schemas.microsoft.com/office/word/2010/wordprocessingGroup" xmlns:wpi="http://schemas.microsoft.com/office/word/2010/wordprocessingInk" xmlns:wne="http://schemas.microsoft.com/office/word/2006/wordml" xmlns:wps="http://schemas.microsoft.com/office/word/2010/wordprocessingShape" mc:Ignorable="w14 w15 w16se w16cid w16 w16cex w16sdtdh wp14">
   <w:p>
     <w:pPr>
@@ -3058,7 +3094,7 @@
 </w:hdr>
 </file>
 
-<file path=word/header8.xml><?xml version="1.0" encoding="utf-8"?>
+<file path=word/header7.xml><?xml version="1.0" encoding="utf-8"?>
 <w:hdr xmlns:wpc="http://schemas.microsoft.com/office/word/2010/wordprocessingCanvas" xmlns:cx="http://schemas.microsoft.com/office/drawing/2014/chartex" xmlns:cx1="http://schemas.microsoft.com/office/drawing/2015/9/8/chartex" xmlns:cx2="http://schemas.microsoft.com/office/drawing/2015/10/21/chartex" xmlns:cx3="http://schemas.microsoft.com/office/drawing/2016/5/9/chartex" xmlns:cx4="http://schemas.microsoft.com/office/drawing/2016/5/10/chartex" xmlns:cx5="http://schemas.microsoft.com/office/drawing/2016/5/11/chartex" xmlns:cx6="http://schemas.microsoft.com/office/drawing/2016/5/12/chartex" xmlns:cx7="http://schemas.microsoft.com/office/drawing/2016/5/13/chartex" xmlns:cx8="http://schemas.microsoft.com/office/drawing/2016/5/14/chartex" xmlns:mc="http://schemas.openxmlformats.org/markup-compatibility/2006" xmlns:aink="http://schemas.microsoft.com/office/drawing/2016/ink" xmlns:am3d="http://schemas.microsoft.com/office/drawing/2017/model3d" xmlns:o="urn:schemas-microsoft-com:office:office" xmlns:oel="http://schemas.microsoft.com/office/2019/extlst" xmlns:r="http://schemas.openxmlformats.org/officeDocument/2006/relationships" xmlns:m="http://schemas.openxmlformats.org/officeDocument/2006/math" xmlns:v="urn:schemas-microsoft-com:vml" xmlns:wp14="http://schemas.microsoft.com/office/word/2010/wordprocessingDrawing" xmlns:wp="http://schemas.openxmlformats.org/drawingml/2006/wordprocessingDrawing" xmlns:w10="urn:schemas-microsoft-com:office:word" xmlns:w="http://schemas.openxmlformats.org/wordprocessingml/2006/main" xmlns:w14="http://schemas.microsoft.com/office/word/2010/wordml" xmlns:w15="http://schemas.microsoft.com/office/word/2012/wordml" xmlns:w16cex="http://schemas.microsoft.com/office/word/2018/wordml/cex" xmlns:w16cid="http://schemas.microsoft.com/office/word/2016/wordml/cid" xmlns:w16="http://schemas.microsoft.com/office/word/2018/wordml" xmlns:w16du="http://schemas.microsoft.com/office/word/2023/wordml/word16du" xmlns:w16sdtdh="http://schemas.microsoft.com/office/word/2020/wordml/sdtdatahash" xmlns:w16se="http://schemas.microsoft.com/office/word/2015/wordml/symex" xmlns:wpg="http://schemas.microsoft.com/office/word/2010/wordprocessingGroup" xmlns:wpi="http://schemas.microsoft.com/office/word/2010/wordprocessingInk" xmlns:wne="http://schemas.microsoft.com/office/word/2006/wordml" xmlns:wps="http://schemas.microsoft.com/office/word/2010/wordprocessingShape" mc:Ignorable="w14 w15 w16se w16cid w16 w16cex w16sdtdh wp14">
   <w:sdt>
     <w:sdtPr>
@@ -3105,7 +3141,7 @@
 </w:hdr>
 </file>
 
-<file path=word/header9.xml><?xml version="1.0" encoding="utf-8"?>
+<file path=word/header8.xml><?xml version="1.0" encoding="utf-8"?>
 <w:hdr xmlns:wpc="http://schemas.microsoft.com/office/word/2010/wordprocessingCanvas" xmlns:cx="http://schemas.microsoft.com/office/drawing/2014/chartex" xmlns:cx1="http://schemas.microsoft.com/office/drawing/2015/9/8/chartex" xmlns:cx2="http://schemas.microsoft.com/office/drawing/2015/10/21/chartex" xmlns:cx3="http://schemas.microsoft.com/office/drawing/2016/5/9/chartex" xmlns:cx4="http://schemas.microsoft.com/office/drawing/2016/5/10/chartex" xmlns:cx5="http://schemas.microsoft.com/office/drawing/2016/5/11/chartex" xmlns:cx6="http://schemas.microsoft.com/office/drawing/2016/5/12/chartex" xmlns:cx7="http://schemas.microsoft.com/office/drawing/2016/5/13/chartex" xmlns:cx8="http://schemas.microsoft.com/office/drawing/2016/5/14/chartex" xmlns:mc="http://schemas.openxmlformats.org/markup-compatibility/2006" xmlns:aink="http://schemas.microsoft.com/office/drawing/2016/ink" xmlns:am3d="http://schemas.microsoft.com/office/drawing/2017/model3d" xmlns:o="urn:schemas-microsoft-com:office:office" xmlns:oel="http://schemas.microsoft.com/office/2019/extlst" xmlns:r="http://schemas.openxmlformats.org/officeDocument/2006/relationships" xmlns:m="http://schemas.openxmlformats.org/officeDocument/2006/math" xmlns:v="urn:schemas-microsoft-com:vml" xmlns:wp14="http://schemas.microsoft.com/office/word/2010/wordprocessingDrawing" xmlns:wp="http://schemas.openxmlformats.org/drawingml/2006/wordprocessingDrawing" xmlns:w10="urn:schemas-microsoft-com:office:word" xmlns:w="http://schemas.openxmlformats.org/wordprocessingml/2006/main" xmlns:w14="http://schemas.microsoft.com/office/word/2010/wordml" xmlns:w15="http://schemas.microsoft.com/office/word/2012/wordml" xmlns:w16cex="http://schemas.microsoft.com/office/word/2018/wordml/cex" xmlns:w16cid="http://schemas.microsoft.com/office/word/2016/wordml/cid" xmlns:w16="http://schemas.microsoft.com/office/word/2018/wordml" xmlns:w16du="http://schemas.microsoft.com/office/word/2023/wordml/word16du" xmlns:w16sdtdh="http://schemas.microsoft.com/office/word/2020/wordml/sdtdatahash" xmlns:w16se="http://schemas.microsoft.com/office/word/2015/wordml/symex" xmlns:wpg="http://schemas.microsoft.com/office/word/2010/wordprocessingGroup" xmlns:wpi="http://schemas.microsoft.com/office/word/2010/wordprocessingInk" xmlns:wne="http://schemas.microsoft.com/office/word/2006/wordml" xmlns:wps="http://schemas.microsoft.com/office/word/2010/wordprocessingShape" mc:Ignorable="w14 w15 w16se w16cid w16 w16cex w16sdtdh wp14">
   <w:p>
     <w:pPr>
@@ -3113,6 +3149,53 @@
       <w:jc w:val="right"/>
     </w:pPr>
   </w:p>
+</w:hdr>
+</file>
+
+<file path=word/header9.xml><?xml version="1.0" encoding="utf-8"?>
+<w:hdr xmlns:wpc="http://schemas.microsoft.com/office/word/2010/wordprocessingCanvas" xmlns:cx="http://schemas.microsoft.com/office/drawing/2014/chartex" xmlns:cx1="http://schemas.microsoft.com/office/drawing/2015/9/8/chartex" xmlns:cx2="http://schemas.microsoft.com/office/drawing/2015/10/21/chartex" xmlns:cx3="http://schemas.microsoft.com/office/drawing/2016/5/9/chartex" xmlns:cx4="http://schemas.microsoft.com/office/drawing/2016/5/10/chartex" xmlns:cx5="http://schemas.microsoft.com/office/drawing/2016/5/11/chartex" xmlns:cx6="http://schemas.microsoft.com/office/drawing/2016/5/12/chartex" xmlns:cx7="http://schemas.microsoft.com/office/drawing/2016/5/13/chartex" xmlns:cx8="http://schemas.microsoft.com/office/drawing/2016/5/14/chartex" xmlns:mc="http://schemas.openxmlformats.org/markup-compatibility/2006" xmlns:aink="http://schemas.microsoft.com/office/drawing/2016/ink" xmlns:am3d="http://schemas.microsoft.com/office/drawing/2017/model3d" xmlns:o="urn:schemas-microsoft-com:office:office" xmlns:oel="http://schemas.microsoft.com/office/2019/extlst" xmlns:r="http://schemas.openxmlformats.org/officeDocument/2006/relationships" xmlns:m="http://schemas.openxmlformats.org/officeDocument/2006/math" xmlns:v="urn:schemas-microsoft-com:vml" xmlns:wp14="http://schemas.microsoft.com/office/word/2010/wordprocessingDrawing" xmlns:wp="http://schemas.openxmlformats.org/drawingml/2006/wordprocessingDrawing" xmlns:w10="urn:schemas-microsoft-com:office:word" xmlns:w="http://schemas.openxmlformats.org/wordprocessingml/2006/main" xmlns:w14="http://schemas.microsoft.com/office/word/2010/wordml" xmlns:w15="http://schemas.microsoft.com/office/word/2012/wordml" xmlns:w16cex="http://schemas.microsoft.com/office/word/2018/wordml/cex" xmlns:w16cid="http://schemas.microsoft.com/office/word/2016/wordml/cid" xmlns:w16="http://schemas.microsoft.com/office/word/2018/wordml" xmlns:w16du="http://schemas.microsoft.com/office/word/2023/wordml/word16du" xmlns:w16sdtdh="http://schemas.microsoft.com/office/word/2020/wordml/sdtdatahash" xmlns:w16se="http://schemas.microsoft.com/office/word/2015/wordml/symex" xmlns:wpg="http://schemas.microsoft.com/office/word/2010/wordprocessingGroup" xmlns:wpi="http://schemas.microsoft.com/office/word/2010/wordprocessingInk" xmlns:wne="http://schemas.microsoft.com/office/word/2006/wordml" xmlns:wps="http://schemas.microsoft.com/office/word/2010/wordprocessingShape" mc:Ignorable="w14 w15 w16se w16cid w16 w16cex w16sdtdh wp14">
+  <w:sdt>
+    <w:sdtPr>
+      <w:id w:val="1498765187"/>
+      <w:docPartObj>
+        <w:docPartGallery w:val="Page Numbers (Top of Page)"/>
+        <w:docPartUnique/>
+      </w:docPartObj>
+    </w:sdtPr>
+    <w:sdtEndPr>
+      <w:rPr>
+        <w:noProof/>
+      </w:rPr>
+    </w:sdtEndPr>
+    <w:sdtContent>
+      <w:p>
+        <w:pPr>
+          <w:pStyle w:val="Header"/>
+        </w:pPr>
+        <w:r>
+          <w:fldChar w:fldCharType="begin"/>
+        </w:r>
+        <w:r>
+          <w:instrText xml:space="preserve"> PAGE   \* MERGEFORMAT </w:instrText>
+        </w:r>
+        <w:r>
+          <w:fldChar w:fldCharType="separate"/>
+        </w:r>
+        <w:r>
+          <w:rPr>
+            <w:noProof/>
+          </w:rPr>
+          <w:t>2</w:t>
+        </w:r>
+        <w:r>
+          <w:rPr>
+            <w:noProof/>
+          </w:rPr>
+          <w:fldChar w:fldCharType="end"/>
+        </w:r>
+      </w:p>
+    </w:sdtContent>
+  </w:sdt>
 </w:hdr>
 </file>
 
@@ -5152,14 +5235,15 @@
     <w:link w:val="PermissionsBodyChar"/>
     <w:autoRedefine/>
     <w:qFormat/>
-    <w:rsid w:val="00D642E4"/>
+    <w:rsid w:val="00F24072"/>
     <w:pPr>
-      <w:spacing w:before="315" w:after="315"/>
+      <w:spacing w:before="160"/>
       <w:ind w:firstLine="0"/>
       <w:contextualSpacing w:val="0"/>
     </w:pPr>
     <w:rPr>
-      <w:sz w:val="24"/>
+      <w:sz w:val="22"/>
+      <w:szCs w:val="22"/>
     </w:rPr>
   </w:style>
   <w:style w:type="character" w:customStyle="1" w:styleId="PermissionsLyricChar">
@@ -5193,10 +5277,11 @@
     <w:name w:val="Permissions Body Char"/>
     <w:basedOn w:val="DefaultParagraphFont"/>
     <w:link w:val="PermissionsBody"/>
-    <w:rsid w:val="00D642E4"/>
+    <w:rsid w:val="00F24072"/>
     <w:rPr>
       <w:rFonts w:ascii="Garamond" w:hAnsi="Garamond"/>
-      <w:sz w:val="24"/>
+      <w:sz w:val="22"/>
+      <w:szCs w:val="22"/>
     </w:rPr>
   </w:style>
   <w:style w:type="paragraph" w:customStyle="1" w:styleId="Colophon">
@@ -5205,7 +5290,10 @@
     <w:link w:val="ColophonChar"/>
     <w:autoRedefine/>
     <w:qFormat/>
-    <w:rsid w:val="00D642E4"/>
+    <w:rsid w:val="00F24072"/>
+    <w:pPr>
+      <w:spacing w:before="160"/>
+    </w:pPr>
   </w:style>
   <w:style w:type="character" w:customStyle="1" w:styleId="AboutAuthorChar">
     <w:name w:val="About Author Char"/>
@@ -5233,7 +5321,7 @@
     <w:name w:val="Colophon Char"/>
     <w:basedOn w:val="DefaultParagraphFont"/>
     <w:link w:val="Colophon"/>
-    <w:rsid w:val="00D642E4"/>
+    <w:rsid w:val="00F24072"/>
     <w:rPr>
       <w:rFonts w:ascii="Garamond" w:hAnsi="Garamond"/>
       <w:sz w:val="22"/>

</xml_diff>